<commit_message>
added lab 4 for databases
</commit_message>
<xml_diff>
--- a/db/Lab3/Lab3.docx
+++ b/db/Lab3/Lab3.docx
@@ -244,7 +244,7 @@
           <w:r>
             <w:fldChar w:fldCharType="separate"/>
           </w:r>
-          <w:hyperlink w:anchor="_Toc222942440" w:history="1">
+          <w:hyperlink w:anchor="_Toc225325271" w:history="1">
             <w:r>
               <w:rPr>
                 <w:rStyle w:val="ac"/>
@@ -271,7 +271,7 @@
                 <w:noProof/>
                 <w:webHidden/>
               </w:rPr>
-              <w:instrText xml:space="preserve"> PAGEREF _Toc222942440 \h </w:instrText>
+              <w:instrText xml:space="preserve"> PAGEREF _Toc225325271 \h </w:instrText>
             </w:r>
             <w:r>
               <w:rPr>
@@ -315,13 +315,13 @@
               <w:lang w:eastAsia="ru-RU"/>
             </w:rPr>
           </w:pPr>
-          <w:hyperlink w:anchor="_Toc222942441" w:history="1">
+          <w:hyperlink w:anchor="_Toc225325272" w:history="1">
             <w:r>
               <w:rPr>
                 <w:rStyle w:val="ac"/>
                 <w:noProof/>
               </w:rPr>
-              <w:t>Запросы</w:t>
+              <w:t>Функциональные зависимости</w:t>
             </w:r>
             <w:r>
               <w:rPr>
@@ -342,7 +342,78 @@
                 <w:noProof/>
                 <w:webHidden/>
               </w:rPr>
-              <w:instrText xml:space="preserve"> PAGEREF _Toc222942441 \h </w:instrText>
+              <w:instrText xml:space="preserve"> PAGEREF _Toc225325272 \h </w:instrText>
+            </w:r>
+            <w:r>
+              <w:rPr>
+                <w:noProof/>
+                <w:webHidden/>
+              </w:rPr>
+            </w:r>
+            <w:r>
+              <w:rPr>
+                <w:noProof/>
+                <w:webHidden/>
+              </w:rPr>
+              <w:fldChar w:fldCharType="separate"/>
+            </w:r>
+            <w:r>
+              <w:rPr>
+                <w:noProof/>
+                <w:webHidden/>
+              </w:rPr>
+              <w:t>3</w:t>
+            </w:r>
+            <w:r>
+              <w:rPr>
+                <w:noProof/>
+                <w:webHidden/>
+              </w:rPr>
+              <w:fldChar w:fldCharType="end"/>
+            </w:r>
+          </w:hyperlink>
+        </w:p>
+        <w:p>
+          <w:pPr>
+            <w:pStyle w:val="11"/>
+            <w:tabs>
+              <w:tab w:val="right" w:leader="dot" w:pos="9345"/>
+            </w:tabs>
+            <w:rPr>
+              <w:rFonts w:asciiTheme="minorHAnsi" w:eastAsiaTheme="minorEastAsia" w:hAnsiTheme="minorHAnsi" w:cstheme="minorBidi"/>
+              <w:noProof/>
+              <w:sz w:val="24"/>
+              <w:lang w:eastAsia="ru-RU"/>
+            </w:rPr>
+          </w:pPr>
+          <w:hyperlink w:anchor="_Toc225325273" w:history="1">
+            <w:r>
+              <w:rPr>
+                <w:rStyle w:val="ac"/>
+                <w:noProof/>
+              </w:rPr>
+              <w:t>Нормализация</w:t>
+            </w:r>
+            <w:r>
+              <w:rPr>
+                <w:noProof/>
+                <w:webHidden/>
+              </w:rPr>
+              <w:tab/>
+            </w:r>
+            <w:r>
+              <w:rPr>
+                <w:noProof/>
+                <w:webHidden/>
+              </w:rPr>
+              <w:fldChar w:fldCharType="begin"/>
+            </w:r>
+            <w:r>
+              <w:rPr>
+                <w:noProof/>
+                <w:webHidden/>
+              </w:rPr>
+              <w:instrText xml:space="preserve"> PAGEREF _Toc225325273 \h </w:instrText>
             </w:r>
             <w:r>
               <w:rPr>
@@ -375,7 +446,7 @@
         </w:p>
         <w:p>
           <w:pPr>
-            <w:pStyle w:val="23"/>
+            <w:pStyle w:val="11"/>
             <w:tabs>
               <w:tab w:val="right" w:leader="dot" w:pos="9345"/>
             </w:tabs>
@@ -386,13 +457,13 @@
               <w:lang w:eastAsia="ru-RU"/>
             </w:rPr>
           </w:pPr>
-          <w:hyperlink w:anchor="_Toc222942442" w:history="1">
+          <w:hyperlink w:anchor="_Toc225325274" w:history="1">
             <w:r>
               <w:rPr>
                 <w:rStyle w:val="ac"/>
                 <w:noProof/>
               </w:rPr>
-              <w:t>Запрос 1</w:t>
+              <w:t>Денормализация</w:t>
             </w:r>
             <w:r>
               <w:rPr>
@@ -413,7 +484,7 @@
                 <w:noProof/>
                 <w:webHidden/>
               </w:rPr>
-              <w:instrText xml:space="preserve"> PAGEREF _Toc222942442 \h </w:instrText>
+              <w:instrText xml:space="preserve"> PAGEREF _Toc225325274 \h </w:instrText>
             </w:r>
             <w:r>
               <w:rPr>
@@ -446,7 +517,7 @@
         </w:p>
         <w:p>
           <w:pPr>
-            <w:pStyle w:val="23"/>
+            <w:pStyle w:val="11"/>
             <w:tabs>
               <w:tab w:val="right" w:leader="dot" w:pos="9345"/>
             </w:tabs>
@@ -457,13 +528,13 @@
               <w:lang w:eastAsia="ru-RU"/>
             </w:rPr>
           </w:pPr>
-          <w:hyperlink w:anchor="_Toc222942443" w:history="1">
+          <w:hyperlink w:anchor="_Toc225325275" w:history="1">
             <w:r>
               <w:rPr>
                 <w:rStyle w:val="ac"/>
                 <w:noProof/>
               </w:rPr>
-              <w:t>Запрос 2</w:t>
+              <w:t>Триггер и функция</w:t>
             </w:r>
             <w:r>
               <w:rPr>
@@ -484,78 +555,7 @@
                 <w:noProof/>
                 <w:webHidden/>
               </w:rPr>
-              <w:instrText xml:space="preserve"> PAGEREF _Toc222942443 \h </w:instrText>
-            </w:r>
-            <w:r>
-              <w:rPr>
-                <w:noProof/>
-                <w:webHidden/>
-              </w:rPr>
-            </w:r>
-            <w:r>
-              <w:rPr>
-                <w:noProof/>
-                <w:webHidden/>
-              </w:rPr>
-              <w:fldChar w:fldCharType="separate"/>
-            </w:r>
-            <w:r>
-              <w:rPr>
-                <w:noProof/>
-                <w:webHidden/>
-              </w:rPr>
-              <w:t>4</w:t>
-            </w:r>
-            <w:r>
-              <w:rPr>
-                <w:noProof/>
-                <w:webHidden/>
-              </w:rPr>
-              <w:fldChar w:fldCharType="end"/>
-            </w:r>
-          </w:hyperlink>
-        </w:p>
-        <w:p>
-          <w:pPr>
-            <w:pStyle w:val="23"/>
-            <w:tabs>
-              <w:tab w:val="right" w:leader="dot" w:pos="9345"/>
-            </w:tabs>
-            <w:rPr>
-              <w:rFonts w:asciiTheme="minorHAnsi" w:eastAsiaTheme="minorEastAsia" w:hAnsiTheme="minorHAnsi" w:cstheme="minorBidi"/>
-              <w:noProof/>
-              <w:sz w:val="24"/>
-              <w:lang w:eastAsia="ru-RU"/>
-            </w:rPr>
-          </w:pPr>
-          <w:hyperlink w:anchor="_Toc222942444" w:history="1">
-            <w:r>
-              <w:rPr>
-                <w:rStyle w:val="ac"/>
-                <w:noProof/>
-              </w:rPr>
-              <w:t>Запрос 3</w:t>
-            </w:r>
-            <w:r>
-              <w:rPr>
-                <w:noProof/>
-                <w:webHidden/>
-              </w:rPr>
-              <w:tab/>
-            </w:r>
-            <w:r>
-              <w:rPr>
-                <w:noProof/>
-                <w:webHidden/>
-              </w:rPr>
-              <w:fldChar w:fldCharType="begin"/>
-            </w:r>
-            <w:r>
-              <w:rPr>
-                <w:noProof/>
-                <w:webHidden/>
-              </w:rPr>
-              <w:instrText xml:space="preserve"> PAGEREF _Toc222942444 \h </w:instrText>
+              <w:instrText xml:space="preserve"> PAGEREF _Toc225325275 \h </w:instrText>
             </w:r>
             <w:r>
               <w:rPr>
@@ -588,7 +588,7 @@
         </w:p>
         <w:p>
           <w:pPr>
-            <w:pStyle w:val="23"/>
+            <w:pStyle w:val="11"/>
             <w:tabs>
               <w:tab w:val="right" w:leader="dot" w:pos="9345"/>
             </w:tabs>
@@ -599,13 +599,13 @@
               <w:lang w:eastAsia="ru-RU"/>
             </w:rPr>
           </w:pPr>
-          <w:hyperlink w:anchor="_Toc222942445" w:history="1">
+          <w:hyperlink w:anchor="_Toc225325276" w:history="1">
             <w:r>
               <w:rPr>
                 <w:rStyle w:val="ac"/>
                 <w:noProof/>
               </w:rPr>
-              <w:t>Запрос 4</w:t>
+              <w:t>Вывод</w:t>
             </w:r>
             <w:r>
               <w:rPr>
@@ -626,78 +626,7 @@
                 <w:noProof/>
                 <w:webHidden/>
               </w:rPr>
-              <w:instrText xml:space="preserve"> PAGEREF _Toc222942445 \h </w:instrText>
-            </w:r>
-            <w:r>
-              <w:rPr>
-                <w:noProof/>
-                <w:webHidden/>
-              </w:rPr>
-            </w:r>
-            <w:r>
-              <w:rPr>
-                <w:noProof/>
-                <w:webHidden/>
-              </w:rPr>
-              <w:fldChar w:fldCharType="separate"/>
-            </w:r>
-            <w:r>
-              <w:rPr>
-                <w:noProof/>
-                <w:webHidden/>
-              </w:rPr>
-              <w:t>5</w:t>
-            </w:r>
-            <w:r>
-              <w:rPr>
-                <w:noProof/>
-                <w:webHidden/>
-              </w:rPr>
-              <w:fldChar w:fldCharType="end"/>
-            </w:r>
-          </w:hyperlink>
-        </w:p>
-        <w:p>
-          <w:pPr>
-            <w:pStyle w:val="23"/>
-            <w:tabs>
-              <w:tab w:val="right" w:leader="dot" w:pos="9345"/>
-            </w:tabs>
-            <w:rPr>
-              <w:rFonts w:asciiTheme="minorHAnsi" w:eastAsiaTheme="minorEastAsia" w:hAnsiTheme="minorHAnsi" w:cstheme="minorBidi"/>
-              <w:noProof/>
-              <w:sz w:val="24"/>
-              <w:lang w:eastAsia="ru-RU"/>
-            </w:rPr>
-          </w:pPr>
-          <w:hyperlink w:anchor="_Toc222942446" w:history="1">
-            <w:r>
-              <w:rPr>
-                <w:rStyle w:val="ac"/>
-                <w:noProof/>
-              </w:rPr>
-              <w:t>Запрос 5</w:t>
-            </w:r>
-            <w:r>
-              <w:rPr>
-                <w:noProof/>
-                <w:webHidden/>
-              </w:rPr>
-              <w:tab/>
-            </w:r>
-            <w:r>
-              <w:rPr>
-                <w:noProof/>
-                <w:webHidden/>
-              </w:rPr>
-              <w:fldChar w:fldCharType="begin"/>
-            </w:r>
-            <w:r>
-              <w:rPr>
-                <w:noProof/>
-                <w:webHidden/>
-              </w:rPr>
-              <w:instrText xml:space="preserve"> PAGEREF _Toc222942446 \h </w:instrText>
+              <w:instrText xml:space="preserve"> PAGEREF _Toc225325276 \h </w:instrText>
             </w:r>
             <w:r>
               <w:rPr>
@@ -729,219 +658,6 @@
           </w:hyperlink>
         </w:p>
         <w:p>
-          <w:pPr>
-            <w:pStyle w:val="23"/>
-            <w:tabs>
-              <w:tab w:val="right" w:leader="dot" w:pos="9345"/>
-            </w:tabs>
-            <w:rPr>
-              <w:rFonts w:asciiTheme="minorHAnsi" w:eastAsiaTheme="minorEastAsia" w:hAnsiTheme="minorHAnsi" w:cstheme="minorBidi"/>
-              <w:noProof/>
-              <w:sz w:val="24"/>
-              <w:lang w:eastAsia="ru-RU"/>
-            </w:rPr>
-          </w:pPr>
-          <w:hyperlink w:anchor="_Toc222942447" w:history="1">
-            <w:r>
-              <w:rPr>
-                <w:rStyle w:val="ac"/>
-                <w:noProof/>
-              </w:rPr>
-              <w:t>Запрос 6</w:t>
-            </w:r>
-            <w:r>
-              <w:rPr>
-                <w:noProof/>
-                <w:webHidden/>
-              </w:rPr>
-              <w:tab/>
-            </w:r>
-            <w:r>
-              <w:rPr>
-                <w:noProof/>
-                <w:webHidden/>
-              </w:rPr>
-              <w:fldChar w:fldCharType="begin"/>
-            </w:r>
-            <w:r>
-              <w:rPr>
-                <w:noProof/>
-                <w:webHidden/>
-              </w:rPr>
-              <w:instrText xml:space="preserve"> PAGEREF _Toc222942447 \h </w:instrText>
-            </w:r>
-            <w:r>
-              <w:rPr>
-                <w:noProof/>
-                <w:webHidden/>
-              </w:rPr>
-            </w:r>
-            <w:r>
-              <w:rPr>
-                <w:noProof/>
-                <w:webHidden/>
-              </w:rPr>
-              <w:fldChar w:fldCharType="separate"/>
-            </w:r>
-            <w:r>
-              <w:rPr>
-                <w:noProof/>
-                <w:webHidden/>
-              </w:rPr>
-              <w:t>7</w:t>
-            </w:r>
-            <w:r>
-              <w:rPr>
-                <w:noProof/>
-                <w:webHidden/>
-              </w:rPr>
-              <w:fldChar w:fldCharType="end"/>
-            </w:r>
-          </w:hyperlink>
-        </w:p>
-        <w:p>
-          <w:pPr>
-            <w:pStyle w:val="23"/>
-            <w:tabs>
-              <w:tab w:val="right" w:leader="dot" w:pos="9345"/>
-            </w:tabs>
-            <w:rPr>
-              <w:rFonts w:asciiTheme="minorHAnsi" w:eastAsiaTheme="minorEastAsia" w:hAnsiTheme="minorHAnsi" w:cstheme="minorBidi"/>
-              <w:noProof/>
-              <w:sz w:val="24"/>
-              <w:lang w:eastAsia="ru-RU"/>
-            </w:rPr>
-          </w:pPr>
-          <w:hyperlink w:anchor="_Toc222942448" w:history="1">
-            <w:r>
-              <w:rPr>
-                <w:rStyle w:val="ac"/>
-                <w:noProof/>
-              </w:rPr>
-              <w:t>Запрос 7</w:t>
-            </w:r>
-            <w:r>
-              <w:rPr>
-                <w:noProof/>
-                <w:webHidden/>
-              </w:rPr>
-              <w:tab/>
-            </w:r>
-            <w:r>
-              <w:rPr>
-                <w:noProof/>
-                <w:webHidden/>
-              </w:rPr>
-              <w:fldChar w:fldCharType="begin"/>
-            </w:r>
-            <w:r>
-              <w:rPr>
-                <w:noProof/>
-                <w:webHidden/>
-              </w:rPr>
-              <w:instrText xml:space="preserve"> PAGEREF _Toc222942448 \h </w:instrText>
-            </w:r>
-            <w:r>
-              <w:rPr>
-                <w:noProof/>
-                <w:webHidden/>
-              </w:rPr>
-            </w:r>
-            <w:r>
-              <w:rPr>
-                <w:noProof/>
-                <w:webHidden/>
-              </w:rPr>
-              <w:fldChar w:fldCharType="separate"/>
-            </w:r>
-            <w:r>
-              <w:rPr>
-                <w:noProof/>
-                <w:webHidden/>
-              </w:rPr>
-              <w:t>8</w:t>
-            </w:r>
-            <w:r>
-              <w:rPr>
-                <w:noProof/>
-                <w:webHidden/>
-              </w:rPr>
-              <w:fldChar w:fldCharType="end"/>
-            </w:r>
-          </w:hyperlink>
-        </w:p>
-        <w:p>
-          <w:pPr>
-            <w:pStyle w:val="11"/>
-            <w:tabs>
-              <w:tab w:val="right" w:leader="dot" w:pos="9345"/>
-            </w:tabs>
-            <w:rPr>
-              <w:rFonts w:asciiTheme="minorHAnsi" w:eastAsiaTheme="minorEastAsia" w:hAnsiTheme="minorHAnsi" w:cstheme="minorBidi"/>
-              <w:noProof/>
-              <w:sz w:val="24"/>
-              <w:lang w:eastAsia="ru-RU"/>
-            </w:rPr>
-          </w:pPr>
-          <w:hyperlink w:anchor="_Toc222942449" w:history="1">
-            <w:r>
-              <w:rPr>
-                <w:rStyle w:val="ac"/>
-                <w:noProof/>
-              </w:rPr>
-              <w:t>Вывод</w:t>
-            </w:r>
-            <w:r>
-              <w:rPr>
-                <w:noProof/>
-                <w:webHidden/>
-              </w:rPr>
-              <w:tab/>
-            </w:r>
-            <w:r>
-              <w:rPr>
-                <w:noProof/>
-                <w:webHidden/>
-              </w:rPr>
-              <w:fldChar w:fldCharType="begin"/>
-            </w:r>
-            <w:r>
-              <w:rPr>
-                <w:noProof/>
-                <w:webHidden/>
-              </w:rPr>
-              <w:instrText xml:space="preserve"> PAGEREF _Toc222942449 \h </w:instrText>
-            </w:r>
-            <w:r>
-              <w:rPr>
-                <w:noProof/>
-                <w:webHidden/>
-              </w:rPr>
-            </w:r>
-            <w:r>
-              <w:rPr>
-                <w:noProof/>
-                <w:webHidden/>
-              </w:rPr>
-              <w:fldChar w:fldCharType="separate"/>
-            </w:r>
-            <w:r>
-              <w:rPr>
-                <w:noProof/>
-                <w:webHidden/>
-              </w:rPr>
-              <w:t>9</w:t>
-            </w:r>
-            <w:r>
-              <w:rPr>
-                <w:noProof/>
-                <w:webHidden/>
-              </w:rPr>
-              <w:fldChar w:fldCharType="end"/>
-            </w:r>
-          </w:hyperlink>
-        </w:p>
-        <w:p>
           <w:r>
             <w:rPr>
               <w:b/>
@@ -1071,9 +787,18 @@
     </w:p>
     <w:p>
       <w:pPr>
+        <w:spacing w:line="360" w:lineRule="auto"/>
+        <w:jc w:val="center"/>
+        <w:rPr>
+          <w:lang w:val="en-US"/>
+        </w:rPr>
+      </w:pPr>
+    </w:p>
+    <w:p>
+      <w:pPr>
         <w:pStyle w:val="1"/>
       </w:pPr>
-      <w:bookmarkStart w:id="0" w:name="_Toc222942440"/>
+      <w:bookmarkStart w:id="0" w:name="_Toc225325271"/>
       <w:r>
         <w:lastRenderedPageBreak/>
         <w:t>Задание</w:t>
@@ -1104,7 +829,15 @@
         </w:numPr>
       </w:pPr>
       <w:r>
-        <w:t>Приведите отношения в 3NF (как минимум). Постройте схему на основеNF (как минимум). </w:t>
+        <w:t xml:space="preserve">Приведите отношения в 3NF (как минимум). Постройте схему на </w:t>
+      </w:r>
+      <w:proofErr w:type="spellStart"/>
+      <w:r>
+        <w:t>основеNF</w:t>
+      </w:r>
+      <w:proofErr w:type="spellEnd"/>
+      <w:r>
+        <w:t xml:space="preserve"> (как минимум). </w:t>
       </w:r>
     </w:p>
     <w:p>
@@ -1115,7 +848,15 @@
         </w:numPr>
       </w:pPr>
       <w:r>
-        <w:t>Опишите изменения в функциональных зависимостях, произошедшие после преобразования в 3NF (как минимум). Постройте схему на основеNF;</w:t>
+        <w:t xml:space="preserve">Опишите изменения в функциональных зависимостях, произошедшие после преобразования в 3NF (как минимум). Постройте схему на </w:t>
+      </w:r>
+      <w:proofErr w:type="spellStart"/>
+      <w:r>
+        <w:t>основеNF</w:t>
+      </w:r>
+      <w:proofErr w:type="spellEnd"/>
+      <w:r>
+        <w:t>;</w:t>
       </w:r>
     </w:p>
     <w:p>
@@ -1137,12 +878,28 @@
         </w:numPr>
       </w:pPr>
       <w:r>
-        <w:t>Какие денормализации будут полезны для вашей схемы? Приведите подробное описание.</w:t>
-      </w:r>
-    </w:p>
-    <w:p>
-      <w:r>
-        <w:t>Придумайте триггер и связанную с ним функцию, относящиеся к вашей предметной области, согласуйте их с преподавателем и реализуйте на языке PL/pgSQL.</w:t>
+        <w:t xml:space="preserve">Какие </w:t>
+      </w:r>
+      <w:proofErr w:type="spellStart"/>
+      <w:r>
+        <w:t>денормализации</w:t>
+      </w:r>
+      <w:proofErr w:type="spellEnd"/>
+      <w:r>
+        <w:t xml:space="preserve"> будут полезны для вашей схемы? Приведите подробное описание.</w:t>
+      </w:r>
+    </w:p>
+    <w:p>
+      <w:r>
+        <w:t>Придумайте триггер и связанную с ним функцию, относящиеся к вашей предметной области, согласуйте их с преподавателем и реализуйте на языке PL/</w:t>
+      </w:r>
+      <w:proofErr w:type="spellStart"/>
+      <w:r>
+        <w:t>pgSQL</w:t>
+      </w:r>
+      <w:proofErr w:type="spellEnd"/>
+      <w:r>
+        <w:t>.</w:t>
       </w:r>
     </w:p>
     <w:p/>
@@ -1150,6 +907,7 @@
       <w:pPr>
         <w:pStyle w:val="1"/>
       </w:pPr>
+      <w:bookmarkStart w:id="1" w:name="_Toc225325272"/>
       <w:r>
         <w:rPr>
           <w:noProof/>
@@ -1222,7 +980,15 @@
                               <w:fldChar w:fldCharType="end"/>
                             </w:r>
                             <w:r>
-                              <w:t>. Даталогическая модель</w:t>
+                              <w:t xml:space="preserve">. </w:t>
+                            </w:r>
+                            <w:proofErr w:type="spellStart"/>
+                            <w:r>
+                              <w:t>Даталогическая</w:t>
+                            </w:r>
+                            <w:proofErr w:type="spellEnd"/>
+                            <w:r>
+                              <w:t xml:space="preserve"> модель</w:t>
                             </w:r>
                           </w:p>
                         </w:txbxContent>
@@ -1279,7 +1045,15 @@
                         <w:fldChar w:fldCharType="end"/>
                       </w:r>
                       <w:r>
-                        <w:t>. Даталогическая модель</w:t>
+                        <w:t xml:space="preserve">. </w:t>
+                      </w:r>
+                      <w:proofErr w:type="spellStart"/>
+                      <w:r>
+                        <w:t>Даталогическая</w:t>
+                      </w:r>
+                      <w:proofErr w:type="spellEnd"/>
+                      <w:r>
+                        <w:t xml:space="preserve"> модель</w:t>
                       </w:r>
                     </w:p>
                   </w:txbxContent>
@@ -1359,6 +1133,7 @@
       <w:r>
         <w:t>Функциональные зависимости</w:t>
       </w:r>
+      <w:bookmarkEnd w:id="1"/>
     </w:p>
     <w:p/>
     <w:p/>
@@ -1367,9 +1142,11 @@
     <w:p/>
     <w:p/>
     <w:p>
+      <w:proofErr w:type="spellStart"/>
       <w:r>
         <w:t>Глл</w:t>
       </w:r>
+      <w:proofErr w:type="spellEnd"/>
     </w:p>
     <w:p>
       <w:r>
@@ -1446,23 +1223,61 @@
         </w:rPr>
         <w:t xml:space="preserve"> (</w:t>
       </w:r>
-      <w:r>
-        <w:rPr>
-          <w:lang w:val="en-US"/>
-        </w:rPr>
-        <w:t xml:space="preserve">departure_date, </w:t>
-      </w:r>
-      <w:r>
-        <w:rPr>
-          <w:lang w:val="en-US"/>
-        </w:rPr>
-        <w:t xml:space="preserve">place_id, research_id, </w:t>
-      </w:r>
-      <w:r>
-        <w:rPr>
-          <w:lang w:val="en-US"/>
-        </w:rPr>
-        <w:t>scientist_id, duration, purpose</w:t>
+      <w:proofErr w:type="spellStart"/>
+      <w:r>
+        <w:rPr>
+          <w:lang w:val="en-US"/>
+        </w:rPr>
+        <w:t>departure_date</w:t>
+      </w:r>
+      <w:proofErr w:type="spellEnd"/>
+      <w:r>
+        <w:rPr>
+          <w:lang w:val="en-US"/>
+        </w:rPr>
+        <w:t xml:space="preserve">, </w:t>
+      </w:r>
+      <w:proofErr w:type="spellStart"/>
+      <w:r>
+        <w:rPr>
+          <w:lang w:val="en-US"/>
+        </w:rPr>
+        <w:t>place_id</w:t>
+      </w:r>
+      <w:proofErr w:type="spellEnd"/>
+      <w:r>
+        <w:rPr>
+          <w:lang w:val="en-US"/>
+        </w:rPr>
+        <w:t xml:space="preserve">, </w:t>
+      </w:r>
+      <w:proofErr w:type="spellStart"/>
+      <w:r>
+        <w:rPr>
+          <w:lang w:val="en-US"/>
+        </w:rPr>
+        <w:t>research_id</w:t>
+      </w:r>
+      <w:proofErr w:type="spellEnd"/>
+      <w:r>
+        <w:rPr>
+          <w:lang w:val="en-US"/>
+        </w:rPr>
+        <w:t xml:space="preserve">, </w:t>
+      </w:r>
+      <w:proofErr w:type="spellStart"/>
+      <w:r>
+        <w:rPr>
+          <w:lang w:val="en-US"/>
+        </w:rPr>
+        <w:t>scientist_id</w:t>
+      </w:r>
+      <w:proofErr w:type="spellEnd"/>
+      <w:r>
+        <w:rPr>
+          <w:lang w:val="en-US"/>
+        </w:rPr>
+        <w:t>, duration, purpose</w:t>
       </w:r>
       <w:r>
         <w:rPr>
@@ -1477,11 +1292,19 @@
           <w:lang w:val="en-US"/>
         </w:rPr>
       </w:pPr>
-      <w:r>
-        <w:rPr>
-          <w:lang w:val="en-US"/>
-        </w:rPr>
-        <w:t>Trip_bone:</w:t>
+      <w:proofErr w:type="spellStart"/>
+      <w:r>
+        <w:rPr>
+          <w:lang w:val="en-US"/>
+        </w:rPr>
+        <w:t>Trip_bone</w:t>
+      </w:r>
+      <w:proofErr w:type="spellEnd"/>
+      <w:r>
+        <w:rPr>
+          <w:lang w:val="en-US"/>
+        </w:rPr>
+        <w:t>:</w:t>
       </w:r>
       <w:r>
         <w:rPr>
@@ -1505,7 +1328,35 @@
         <w:rPr>
           <w:lang w:val="en-US"/>
         </w:rPr>
-        <w:t xml:space="preserve"> (trip_id, bone_id)</w:t>
+        <w:t xml:space="preserve"> (</w:t>
+      </w:r>
+      <w:proofErr w:type="spellStart"/>
+      <w:r>
+        <w:rPr>
+          <w:lang w:val="en-US"/>
+        </w:rPr>
+        <w:t>trip_id</w:t>
+      </w:r>
+      <w:proofErr w:type="spellEnd"/>
+      <w:r>
+        <w:rPr>
+          <w:lang w:val="en-US"/>
+        </w:rPr>
+        <w:t xml:space="preserve">, </w:t>
+      </w:r>
+      <w:proofErr w:type="spellStart"/>
+      <w:r>
+        <w:rPr>
+          <w:lang w:val="en-US"/>
+        </w:rPr>
+        <w:t>bone_id</w:t>
+      </w:r>
+      <w:proofErr w:type="spellEnd"/>
+      <w:r>
+        <w:rPr>
+          <w:lang w:val="en-US"/>
+        </w:rPr>
+        <w:t>)</w:t>
       </w:r>
     </w:p>
     <w:p>
@@ -1542,13 +1393,35 @@
         <w:rPr>
           <w:lang w:val="en-US"/>
         </w:rPr>
-        <w:t xml:space="preserve"> (bone_type_id</w:t>
-      </w:r>
-      <w:r>
-        <w:rPr>
-          <w:lang w:val="en-US"/>
-        </w:rPr>
-        <w:t>, reptile_id, condition</w:t>
+        <w:t xml:space="preserve"> (</w:t>
+      </w:r>
+      <w:proofErr w:type="spellStart"/>
+      <w:r>
+        <w:rPr>
+          <w:lang w:val="en-US"/>
+        </w:rPr>
+        <w:t>bone_type_id</w:t>
+      </w:r>
+      <w:proofErr w:type="spellEnd"/>
+      <w:r>
+        <w:rPr>
+          <w:lang w:val="en-US"/>
+        </w:rPr>
+        <w:t xml:space="preserve">, </w:t>
+      </w:r>
+      <w:proofErr w:type="spellStart"/>
+      <w:r>
+        <w:rPr>
+          <w:lang w:val="en-US"/>
+        </w:rPr>
+        <w:t>reptile_id</w:t>
+      </w:r>
+      <w:proofErr w:type="spellEnd"/>
+      <w:r>
+        <w:rPr>
+          <w:lang w:val="en-US"/>
+        </w:rPr>
+        <w:t>, condition</w:t>
       </w:r>
       <w:r>
         <w:rPr>
@@ -1563,11 +1436,19 @@
           <w:lang w:val="en-US"/>
         </w:rPr>
       </w:pPr>
-      <w:r>
-        <w:rPr>
-          <w:lang w:val="en-US"/>
-        </w:rPr>
-        <w:t>Bone_type:</w:t>
+      <w:proofErr w:type="spellStart"/>
+      <w:r>
+        <w:rPr>
+          <w:lang w:val="en-US"/>
+        </w:rPr>
+        <w:t>Bone_type</w:t>
+      </w:r>
+      <w:proofErr w:type="spellEnd"/>
+      <w:r>
+        <w:rPr>
+          <w:lang w:val="en-US"/>
+        </w:rPr>
+        <w:t>:</w:t>
       </w:r>
       <w:r>
         <w:rPr>
@@ -1591,7 +1472,21 @@
         <w:rPr>
           <w:lang w:val="en-US"/>
         </w:rPr>
-        <w:t xml:space="preserve"> (bone_type)</w:t>
+        <w:t xml:space="preserve"> (</w:t>
+      </w:r>
+      <w:proofErr w:type="spellStart"/>
+      <w:r>
+        <w:rPr>
+          <w:lang w:val="en-US"/>
+        </w:rPr>
+        <w:t>bone_type</w:t>
+      </w:r>
+      <w:proofErr w:type="spellEnd"/>
+      <w:r>
+        <w:rPr>
+          <w:lang w:val="en-US"/>
+        </w:rPr>
+        <w:t>)</w:t>
       </w:r>
     </w:p>
     <w:p>
@@ -1788,16 +1683,60 @@
         <w:rPr>
           <w:lang w:val="en-US"/>
         </w:rPr>
-        <w:t xml:space="preserve"> (education_level, receiving_date, receiving_place)</w:t>
+        <w:t xml:space="preserve"> (</w:t>
+      </w:r>
+      <w:proofErr w:type="spellStart"/>
+      <w:r>
+        <w:rPr>
+          <w:lang w:val="en-US"/>
+        </w:rPr>
+        <w:t>education_level</w:t>
+      </w:r>
+      <w:proofErr w:type="spellEnd"/>
+      <w:r>
+        <w:rPr>
+          <w:lang w:val="en-US"/>
+        </w:rPr>
+        <w:t xml:space="preserve">, </w:t>
+      </w:r>
+      <w:proofErr w:type="spellStart"/>
+      <w:r>
+        <w:rPr>
+          <w:lang w:val="en-US"/>
+        </w:rPr>
+        <w:t>receiving_date</w:t>
+      </w:r>
+      <w:proofErr w:type="spellEnd"/>
+      <w:r>
+        <w:rPr>
+          <w:lang w:val="en-US"/>
+        </w:rPr>
+        <w:t xml:space="preserve">, </w:t>
+      </w:r>
+      <w:proofErr w:type="spellStart"/>
+      <w:r>
+        <w:rPr>
+          <w:lang w:val="en-US"/>
+        </w:rPr>
+        <w:t>receiving_place</w:t>
+      </w:r>
+      <w:proofErr w:type="spellEnd"/>
+      <w:r>
+        <w:rPr>
+          <w:lang w:val="en-US"/>
+        </w:rPr>
+        <w:t>)</w:t>
       </w:r>
     </w:p>
     <w:p>
       <w:pPr>
         <w:pStyle w:val="1"/>
       </w:pPr>
+      <w:bookmarkStart w:id="2" w:name="_Toc225325273"/>
       <w:r>
         <w:t>Нормализация</w:t>
       </w:r>
+      <w:bookmarkEnd w:id="2"/>
     </w:p>
     <w:p>
       <w:r>
@@ -1828,10 +1767,10 @@
         <w:t xml:space="preserve">, </w:t>
       </w:r>
       <w:r>
-        <w:t xml:space="preserve">так как </w:t>
-      </w:r>
-      <w:r>
-        <w:t>на пересечении каждой строки и столбца содержится только одно значение.</w:t>
+        <w:t>так как в атрибутах может содержаться только одно значение, нет дублирующихся строк, а также в столбцах могут содержаться значения только одного типа</w:t>
+      </w:r>
+      <w:r>
+        <w:t>.</w:t>
       </w:r>
     </w:p>
     <w:p>
@@ -1884,7 +1823,81 @@
         <w:t xml:space="preserve"> </w:t>
       </w:r>
       <w:r>
-        <w:t>и нет частичных зависимостей от потенциальных ключей, то есть неключевые атрибуты в полной функциональной зависимости от первичного ключа</w:t>
+        <w:t>и нет частичных зависимостей от потенциальных ключей, то есть неключевые атрибуты в полной функциональной зависимости от первичного ключа.</w:t>
+      </w:r>
+    </w:p>
+    <w:p>
+      <w:r>
+        <w:t>3</w:t>
+      </w:r>
+      <w:r>
+        <w:rPr>
+          <w:lang w:val="en-US"/>
+        </w:rPr>
+        <w:t>NF</w:t>
+      </w:r>
+      <w:r>
+        <w:t xml:space="preserve">: </w:t>
+      </w:r>
+      <w:r>
+        <w:t xml:space="preserve">Моя модель удовлетворяет </w:t>
+      </w:r>
+      <w:r>
+        <w:t>3</w:t>
+      </w:r>
+      <w:r>
+        <w:rPr>
+          <w:lang w:val="en-US"/>
+        </w:rPr>
+        <w:t>NF</w:t>
+      </w:r>
+      <w:r>
+        <w:t xml:space="preserve">, </w:t>
+      </w:r>
+      <w:r>
+        <w:t>так как</w:t>
+      </w:r>
+      <w:r>
+        <w:t xml:space="preserve"> </w:t>
+      </w:r>
+      <w:r>
+        <w:t xml:space="preserve">она удовлетворяет </w:t>
+      </w:r>
+      <w:r>
+        <w:t>1</w:t>
+      </w:r>
+      <w:r>
+        <w:rPr>
+          <w:lang w:val="en-US"/>
+        </w:rPr>
+        <w:t>NF</w:t>
+      </w:r>
+      <w:r>
+        <w:t xml:space="preserve"> </w:t>
+      </w:r>
+      <w:r>
+        <w:t>и 2</w:t>
+      </w:r>
+      <w:r>
+        <w:rPr>
+          <w:lang w:val="en-US"/>
+        </w:rPr>
+        <w:t>NF</w:t>
+      </w:r>
+      <w:r>
+        <w:t xml:space="preserve"> </w:t>
+      </w:r>
+      <w:r>
+        <w:t>и</w:t>
+      </w:r>
+      <w:r>
+        <w:t xml:space="preserve"> </w:t>
+      </w:r>
+      <w:r>
+        <w:t xml:space="preserve">нет </w:t>
+      </w:r>
+      <w:r>
+        <w:t>транзитивных зависимостей от потенциальных ключей</w:t>
       </w:r>
       <w:r>
         <w:t>.</w:t>
@@ -1892,13 +1905,10 @@
     </w:p>
     <w:p>
       <w:r>
-        <w:t>3</w:t>
-      </w:r>
-      <w:r>
-        <w:rPr>
-          <w:lang w:val="en-US"/>
-        </w:rPr>
-        <w:t>NF</w:t>
+        <w:rPr>
+          <w:lang w:val="en-US"/>
+        </w:rPr>
+        <w:t>BCNF</w:t>
       </w:r>
       <w:r>
         <w:t xml:space="preserve">: </w:t>
@@ -1907,1004 +1917,1271 @@
         <w:t xml:space="preserve">Моя модель удовлетворяет </w:t>
       </w:r>
       <w:r>
-        <w:t>3</w:t>
-      </w:r>
-      <w:r>
-        <w:rPr>
-          <w:lang w:val="en-US"/>
-        </w:rPr>
-        <w:t>NF</w:t>
+        <w:rPr>
+          <w:lang w:val="en-US"/>
+        </w:rPr>
+        <w:t>BCNF</w:t>
       </w:r>
       <w:r>
         <w:t xml:space="preserve">, </w:t>
       </w:r>
       <w:r>
-        <w:t>так как</w:t>
+        <w:t>так как она не содержит</w:t>
+      </w:r>
+      <w:r>
+        <w:t xml:space="preserve"> составных ключей и, следовательно, части составных ключей не зависят от неключевых значений</w:t>
+      </w:r>
+      <w:r>
+        <w:t>.</w:t>
+      </w:r>
+    </w:p>
+    <w:p>
+      <w:pPr>
+        <w:pStyle w:val="1"/>
+      </w:pPr>
+      <w:bookmarkStart w:id="3" w:name="_Toc225325274"/>
+      <w:proofErr w:type="spellStart"/>
+      <w:r>
+        <w:t>Денормализация</w:t>
+      </w:r>
+      <w:bookmarkEnd w:id="3"/>
+      <w:proofErr w:type="spellEnd"/>
+    </w:p>
+    <w:p>
+      <w:r>
+        <w:t xml:space="preserve">Чтобы уменьшить количество операций </w:t>
+      </w:r>
+      <w:r>
+        <w:rPr>
+          <w:lang w:val="en-US"/>
+        </w:rPr>
+        <w:t>JOIN</w:t>
       </w:r>
       <w:r>
         <w:t xml:space="preserve"> </w:t>
       </w:r>
       <w:r>
-        <w:t xml:space="preserve">она удовлетворяет </w:t>
-      </w:r>
-      <w:r>
-        <w:t>1</w:t>
-      </w:r>
-      <w:r>
-        <w:rPr>
-          <w:lang w:val="en-US"/>
-        </w:rPr>
-        <w:t>N</w:t>
-      </w:r>
-      <w:r>
-        <w:rPr>
-          <w:lang w:val="en-US"/>
-        </w:rPr>
-        <w:t>F</w:t>
+        <w:t>и ускорить обработку запрос</w:t>
+      </w:r>
+      <w:r>
+        <w:t>а</w:t>
+      </w:r>
+      <w:r>
+        <w:t xml:space="preserve">, можно объединить некоторые таблицы. Например, объединить таблицы </w:t>
+      </w:r>
+      <w:r>
+        <w:rPr>
+          <w:lang w:val="en-US"/>
+        </w:rPr>
+        <w:t>Scientist</w:t>
       </w:r>
       <w:r>
         <w:t xml:space="preserve"> </w:t>
       </w:r>
       <w:r>
-        <w:t>и 2</w:t>
-      </w:r>
-      <w:r>
-        <w:rPr>
-          <w:lang w:val="en-US"/>
-        </w:rPr>
-        <w:t>NF</w:t>
-      </w:r>
-      <w:r>
+        <w:t xml:space="preserve">и </w:t>
+      </w:r>
+      <w:r>
+        <w:rPr>
+          <w:lang w:val="en-US"/>
+        </w:rPr>
+        <w:t>Education</w:t>
+      </w:r>
+      <w:r>
+        <w:t xml:space="preserve">, </w:t>
+      </w:r>
+      <w:r>
+        <w:t xml:space="preserve">если часто нужен </w:t>
+      </w:r>
+      <w:r>
+        <w:t>получать значение</w:t>
+      </w:r>
+      <w:r>
+        <w:t xml:space="preserve"> уровн</w:t>
+      </w:r>
+      <w:r>
+        <w:t>я</w:t>
+      </w:r>
+      <w:r>
+        <w:t xml:space="preserve"> образования ученого.</w:t>
+      </w:r>
+    </w:p>
+    <w:p>
+      <w:pPr>
+        <w:pStyle w:val="1"/>
+      </w:pPr>
+      <w:bookmarkStart w:id="4" w:name="_Toc225325275"/>
+      <w:r>
+        <w:lastRenderedPageBreak/>
+        <w:t>Триггер и функция</w:t>
+      </w:r>
+      <w:bookmarkEnd w:id="4"/>
+    </w:p>
+    <w:p>
+      <w:r>
+        <w:t>Функция вычисляет стаж ученого, то есть находит дату первой командировки (</w:t>
+      </w:r>
+      <w:r>
+        <w:rPr>
+          <w:lang w:val="en-US"/>
+        </w:rPr>
+        <w:t>Trip</w:t>
+      </w:r>
+      <w:r>
+        <w:t>) и вычитает ее из текущей даты.</w:t>
+      </w:r>
+    </w:p>
+    <w:p>
+      <w:pPr>
+        <w:pStyle w:val="af"/>
+        <w:rPr>
+          <w:color w:val="000000"/>
+        </w:rPr>
+      </w:pPr>
+      <w:r>
+        <w:t>CREATE OR REPLACE</w:t>
+      </w:r>
+      <w:r>
+        <w:rPr>
+          <w:color w:val="000000"/>
+        </w:rPr>
         <w:t xml:space="preserve"> </w:t>
       </w:r>
       <w:r>
-        <w:t>и</w:t>
-      </w:r>
-      <w:r>
+        <w:t>FUNCTION</w:t>
+      </w:r>
+      <w:r>
+        <w:rPr>
+          <w:color w:val="000000"/>
+        </w:rPr>
         <w:t xml:space="preserve"> </w:t>
       </w:r>
-      <w:r>
-        <w:t xml:space="preserve">нет </w:t>
-      </w:r>
-      <w:r>
-        <w:t>транзитивных зависимостей от потенциальных ключей</w:t>
-      </w:r>
-      <w:r>
-        <w:t>.</w:t>
-      </w:r>
-    </w:p>
-    <w:p>
-      <w:r>
-        <w:rPr>
-          <w:lang w:val="en-US"/>
-        </w:rPr>
-        <w:t>BCNF</w:t>
-      </w:r>
-      <w:r>
-        <w:t xml:space="preserve">: </w:t>
-      </w:r>
-      <w:r>
-        <w:t xml:space="preserve">Моя модель удовлетворяет </w:t>
-      </w:r>
-      <w:r>
-        <w:rPr>
-          <w:lang w:val="en-US"/>
-        </w:rPr>
-        <w:t>BCNF</w:t>
-      </w:r>
-      <w:r>
+      <w:proofErr w:type="spellStart"/>
+      <w:r>
+        <w:t>trigger_calculate_scientist_</w:t>
+      </w:r>
+      <w:proofErr w:type="gramStart"/>
+      <w:r>
+        <w:t>experience</w:t>
+      </w:r>
+      <w:proofErr w:type="spellEnd"/>
+      <w:r>
+        <w:rPr>
+          <w:color w:val="000000"/>
+        </w:rPr>
+        <w:t>(</w:t>
+      </w:r>
+      <w:proofErr w:type="gramEnd"/>
+      <w:r>
+        <w:rPr>
+          <w:color w:val="000000"/>
+        </w:rPr>
+        <w:t>)</w:t>
+      </w:r>
+    </w:p>
+    <w:p>
+      <w:pPr>
+        <w:pStyle w:val="af"/>
+        <w:rPr>
+          <w:color w:val="000000"/>
+        </w:rPr>
+      </w:pPr>
+      <w:r>
+        <w:t>RETURNS</w:t>
+      </w:r>
+      <w:r>
+        <w:rPr>
+          <w:color w:val="000000"/>
+        </w:rPr>
+        <w:t xml:space="preserve"> TRIGGER </w:t>
+      </w:r>
+      <w:r>
+        <w:t>AS</w:t>
+      </w:r>
+      <w:r>
+        <w:rPr>
+          <w:color w:val="000000"/>
+        </w:rPr>
+        <w:t xml:space="preserve"> $$</w:t>
+      </w:r>
+    </w:p>
+    <w:p>
+      <w:pPr>
+        <w:pStyle w:val="af"/>
+        <w:rPr>
+          <w:color w:val="000000"/>
+        </w:rPr>
+      </w:pPr>
+      <w:r>
+        <w:t>DECLARE</w:t>
+      </w:r>
+    </w:p>
+    <w:p>
+      <w:pPr>
+        <w:pStyle w:val="af"/>
+        <w:rPr>
+          <w:color w:val="000000"/>
+        </w:rPr>
+      </w:pPr>
+      <w:r>
+        <w:rPr>
+          <w:color w:val="000000"/>
+        </w:rPr>
+        <w:t xml:space="preserve">    </w:t>
+      </w:r>
+      <w:proofErr w:type="spellStart"/>
+      <w:r>
+        <w:rPr>
+          <w:color w:val="000000"/>
+        </w:rPr>
+        <w:t>first_trip_date</w:t>
+      </w:r>
+      <w:proofErr w:type="spellEnd"/>
+      <w:r>
+        <w:rPr>
+          <w:color w:val="000000"/>
+        </w:rPr>
+        <w:t xml:space="preserve"> </w:t>
+      </w:r>
+      <w:r>
+        <w:t>DATE</w:t>
+      </w:r>
+      <w:r>
+        <w:rPr>
+          <w:color w:val="000000"/>
+        </w:rPr>
+        <w:t>;</w:t>
+      </w:r>
+    </w:p>
+    <w:p>
+      <w:pPr>
+        <w:pStyle w:val="af"/>
+        <w:rPr>
+          <w:color w:val="000000"/>
+        </w:rPr>
+      </w:pPr>
+      <w:r>
+        <w:rPr>
+          <w:color w:val="000000"/>
+        </w:rPr>
+        <w:t xml:space="preserve">    </w:t>
+      </w:r>
+      <w:proofErr w:type="spellStart"/>
+      <w:r>
+        <w:rPr>
+          <w:color w:val="000000"/>
+        </w:rPr>
+        <w:t>new_experience</w:t>
+      </w:r>
+      <w:proofErr w:type="spellEnd"/>
+      <w:r>
+        <w:rPr>
+          <w:color w:val="000000"/>
+        </w:rPr>
+        <w:t xml:space="preserve"> INTERVAL;</w:t>
+      </w:r>
+    </w:p>
+    <w:p>
+      <w:pPr>
+        <w:pStyle w:val="af"/>
+        <w:rPr>
+          <w:color w:val="000000"/>
+        </w:rPr>
+      </w:pPr>
+      <w:r>
+        <w:t>BEGIN</w:t>
+      </w:r>
+    </w:p>
+    <w:p>
+      <w:pPr>
+        <w:pStyle w:val="af"/>
+        <w:rPr>
+          <w:color w:val="000000"/>
+        </w:rPr>
+      </w:pPr>
+      <w:r>
+        <w:rPr>
+          <w:color w:val="000000"/>
+        </w:rPr>
+        <w:t xml:space="preserve"> RAISE NOTICE </w:t>
+      </w:r>
+      <w:r>
+        <w:rPr>
+          <w:color w:val="A31515"/>
+        </w:rPr>
+        <w:t xml:space="preserve">'Calculating experience for </w:t>
+      </w:r>
+      <w:proofErr w:type="spellStart"/>
+      <w:r>
+        <w:rPr>
+          <w:color w:val="A31515"/>
+        </w:rPr>
+        <w:t>scientist_id</w:t>
+      </w:r>
+      <w:proofErr w:type="spellEnd"/>
+      <w:r>
+        <w:rPr>
+          <w:color w:val="A31515"/>
+        </w:rPr>
+        <w:t>: %'</w:t>
+      </w:r>
+      <w:r>
+        <w:rPr>
+          <w:color w:val="000000"/>
+        </w:rPr>
         <w:t xml:space="preserve">, </w:t>
       </w:r>
-      <w:r>
-        <w:t>так как она не содержит функциональных зависимостей от наборов атрибутов, не являющихся надключами.</w:t>
-      </w:r>
+      <w:proofErr w:type="spellStart"/>
+      <w:r>
+        <w:rPr>
+          <w:color w:val="000000"/>
+        </w:rPr>
+        <w:t>NEW.scientist_id</w:t>
+      </w:r>
+      <w:proofErr w:type="spellEnd"/>
+      <w:r>
+        <w:rPr>
+          <w:color w:val="000000"/>
+        </w:rPr>
+        <w:t>;</w:t>
+      </w:r>
+    </w:p>
+    <w:p>
+      <w:pPr>
+        <w:pStyle w:val="af"/>
+        <w:rPr>
+          <w:color w:val="000000"/>
+        </w:rPr>
+      </w:pPr>
+      <w:r>
+        <w:rPr>
+          <w:color w:val="000000"/>
+        </w:rPr>
+        <w:t xml:space="preserve">    </w:t>
+      </w:r>
+      <w:r>
+        <w:t>SELECT</w:t>
+      </w:r>
+      <w:r>
+        <w:rPr>
+          <w:color w:val="000000"/>
+        </w:rPr>
+        <w:t xml:space="preserve"> </w:t>
+      </w:r>
+      <w:proofErr w:type="gramStart"/>
+      <w:r>
+        <w:t>MIN</w:t>
+      </w:r>
+      <w:r>
+        <w:rPr>
+          <w:color w:val="000000"/>
+        </w:rPr>
+        <w:t>(</w:t>
+      </w:r>
+      <w:proofErr w:type="spellStart"/>
+      <w:proofErr w:type="gramEnd"/>
+      <w:r>
+        <w:rPr>
+          <w:color w:val="000000"/>
+        </w:rPr>
+        <w:t>departure_date</w:t>
+      </w:r>
+      <w:proofErr w:type="spellEnd"/>
+      <w:r>
+        <w:rPr>
+          <w:color w:val="000000"/>
+        </w:rPr>
+        <w:t xml:space="preserve">) </w:t>
+      </w:r>
+      <w:r>
+        <w:t>INTO</w:t>
+      </w:r>
+      <w:r>
+        <w:rPr>
+          <w:color w:val="000000"/>
+        </w:rPr>
+        <w:t xml:space="preserve"> </w:t>
+      </w:r>
+      <w:proofErr w:type="spellStart"/>
+      <w:r>
+        <w:rPr>
+          <w:color w:val="000000"/>
+        </w:rPr>
+        <w:t>first_trip_date</w:t>
+      </w:r>
+      <w:proofErr w:type="spellEnd"/>
+    </w:p>
+    <w:p>
+      <w:pPr>
+        <w:pStyle w:val="af"/>
+        <w:rPr>
+          <w:color w:val="000000"/>
+        </w:rPr>
+      </w:pPr>
+      <w:r>
+        <w:rPr>
+          <w:color w:val="000000"/>
+        </w:rPr>
+        <w:t xml:space="preserve">    </w:t>
+      </w:r>
+      <w:r>
+        <w:t>FROM</w:t>
+      </w:r>
+      <w:r>
+        <w:rPr>
+          <w:color w:val="000000"/>
+        </w:rPr>
+        <w:t xml:space="preserve"> Trip</w:t>
+      </w:r>
+    </w:p>
+    <w:p>
+      <w:pPr>
+        <w:pStyle w:val="af"/>
+        <w:rPr>
+          <w:color w:val="000000"/>
+        </w:rPr>
+      </w:pPr>
+      <w:r>
+        <w:rPr>
+          <w:color w:val="000000"/>
+        </w:rPr>
+        <w:t xml:space="preserve">    </w:t>
+      </w:r>
+      <w:r>
+        <w:t>WHERE</w:t>
+      </w:r>
+      <w:r>
+        <w:rPr>
+          <w:color w:val="000000"/>
+        </w:rPr>
+        <w:t xml:space="preserve"> </w:t>
+      </w:r>
+      <w:proofErr w:type="spellStart"/>
+      <w:r>
+        <w:rPr>
+          <w:color w:val="000000"/>
+        </w:rPr>
+        <w:t>scientist_id</w:t>
+      </w:r>
+      <w:proofErr w:type="spellEnd"/>
+      <w:r>
+        <w:rPr>
+          <w:color w:val="000000"/>
+        </w:rPr>
+        <w:t xml:space="preserve"> = </w:t>
+      </w:r>
+      <w:proofErr w:type="spellStart"/>
+      <w:r>
+        <w:rPr>
+          <w:color w:val="000000"/>
+        </w:rPr>
+        <w:t>NEW.scientist_id</w:t>
+      </w:r>
+      <w:proofErr w:type="spellEnd"/>
+      <w:r>
+        <w:rPr>
+          <w:color w:val="000000"/>
+        </w:rPr>
+        <w:t>;</w:t>
+      </w:r>
+    </w:p>
+    <w:p>
+      <w:pPr>
+        <w:pStyle w:val="af"/>
+        <w:rPr>
+          <w:color w:val="000000"/>
+        </w:rPr>
+      </w:pPr>
+    </w:p>
+    <w:p>
+      <w:pPr>
+        <w:pStyle w:val="af"/>
+        <w:rPr>
+          <w:color w:val="000000"/>
+        </w:rPr>
+      </w:pPr>
+      <w:r>
+        <w:rPr>
+          <w:color w:val="000000"/>
+        </w:rPr>
+        <w:t xml:space="preserve">    RAISE NOTICE </w:t>
+      </w:r>
+      <w:r>
+        <w:rPr>
+          <w:color w:val="A31515"/>
+        </w:rPr>
+        <w:t>'First trip date: %'</w:t>
+      </w:r>
+      <w:r>
+        <w:rPr>
+          <w:color w:val="000000"/>
+        </w:rPr>
+        <w:t xml:space="preserve">, </w:t>
+      </w:r>
+      <w:proofErr w:type="spellStart"/>
+      <w:r>
+        <w:rPr>
+          <w:color w:val="000000"/>
+        </w:rPr>
+        <w:t>first_trip_date</w:t>
+      </w:r>
+      <w:proofErr w:type="spellEnd"/>
+      <w:r>
+        <w:rPr>
+          <w:color w:val="000000"/>
+        </w:rPr>
+        <w:t>;</w:t>
+      </w:r>
+    </w:p>
+    <w:p>
+      <w:pPr>
+        <w:pStyle w:val="af"/>
+        <w:rPr>
+          <w:color w:val="000000"/>
+        </w:rPr>
+      </w:pPr>
+    </w:p>
+    <w:p>
+      <w:pPr>
+        <w:pStyle w:val="af"/>
+        <w:rPr>
+          <w:color w:val="000000"/>
+        </w:rPr>
+      </w:pPr>
+      <w:r>
+        <w:rPr>
+          <w:color w:val="000000"/>
+        </w:rPr>
+        <w:t xml:space="preserve">    </w:t>
+      </w:r>
+      <w:r>
+        <w:t>IF</w:t>
+      </w:r>
+      <w:r>
+        <w:rPr>
+          <w:color w:val="000000"/>
+        </w:rPr>
+        <w:t xml:space="preserve"> </w:t>
+      </w:r>
+      <w:proofErr w:type="spellStart"/>
+      <w:r>
+        <w:rPr>
+          <w:color w:val="000000"/>
+        </w:rPr>
+        <w:t>first_trip_date</w:t>
+      </w:r>
+      <w:proofErr w:type="spellEnd"/>
+      <w:r>
+        <w:rPr>
+          <w:color w:val="000000"/>
+        </w:rPr>
+        <w:t xml:space="preserve"> </w:t>
+      </w:r>
+      <w:r>
+        <w:t>IS</w:t>
+      </w:r>
+      <w:r>
+        <w:rPr>
+          <w:color w:val="000000"/>
+        </w:rPr>
+        <w:t xml:space="preserve"> </w:t>
+      </w:r>
+      <w:r>
+        <w:t>NULL</w:t>
+      </w:r>
+      <w:r>
+        <w:rPr>
+          <w:color w:val="000000"/>
+        </w:rPr>
+        <w:t xml:space="preserve"> </w:t>
+      </w:r>
+      <w:r>
+        <w:t>THEN</w:t>
+      </w:r>
+    </w:p>
+    <w:p>
+      <w:pPr>
+        <w:pStyle w:val="af"/>
+        <w:rPr>
+          <w:color w:val="000000"/>
+        </w:rPr>
+      </w:pPr>
+      <w:r>
+        <w:rPr>
+          <w:color w:val="000000"/>
+        </w:rPr>
+        <w:t xml:space="preserve">        RAISE EXCEPTION </w:t>
+      </w:r>
+      <w:r>
+        <w:rPr>
+          <w:color w:val="A31515"/>
+        </w:rPr>
+        <w:t>'No trips found for the scientist with ID %'</w:t>
+      </w:r>
+      <w:r>
+        <w:rPr>
+          <w:color w:val="000000"/>
+        </w:rPr>
+        <w:t xml:space="preserve">, </w:t>
+      </w:r>
+      <w:proofErr w:type="spellStart"/>
+      <w:r>
+        <w:rPr>
+          <w:color w:val="000000"/>
+        </w:rPr>
+        <w:t>NEW.scientist_id</w:t>
+      </w:r>
+      <w:proofErr w:type="spellEnd"/>
+      <w:r>
+        <w:rPr>
+          <w:color w:val="000000"/>
+        </w:rPr>
+        <w:t>;</w:t>
+      </w:r>
+    </w:p>
+    <w:p>
+      <w:pPr>
+        <w:pStyle w:val="af"/>
+        <w:rPr>
+          <w:color w:val="000000"/>
+        </w:rPr>
+      </w:pPr>
+      <w:r>
+        <w:rPr>
+          <w:color w:val="000000"/>
+        </w:rPr>
+        <w:t xml:space="preserve">    ELSIF </w:t>
+      </w:r>
+      <w:proofErr w:type="spellStart"/>
+      <w:r>
+        <w:rPr>
+          <w:color w:val="000000"/>
+        </w:rPr>
+        <w:t>first_trip_date</w:t>
+      </w:r>
+      <w:proofErr w:type="spellEnd"/>
+      <w:r>
+        <w:rPr>
+          <w:color w:val="000000"/>
+        </w:rPr>
+        <w:t xml:space="preserve"> &gt; CURRENT_DATE </w:t>
+      </w:r>
+      <w:r>
+        <w:t>THEN</w:t>
+      </w:r>
+    </w:p>
+    <w:p>
+      <w:pPr>
+        <w:pStyle w:val="af"/>
+        <w:rPr>
+          <w:color w:val="000000"/>
+        </w:rPr>
+      </w:pPr>
+      <w:r>
+        <w:rPr>
+          <w:color w:val="000000"/>
+        </w:rPr>
+        <w:t xml:space="preserve">        </w:t>
+      </w:r>
+      <w:r>
+        <w:t>UPDATE</w:t>
+      </w:r>
+      <w:r>
+        <w:rPr>
+          <w:color w:val="000000"/>
+        </w:rPr>
+        <w:t xml:space="preserve"> Scientist</w:t>
+      </w:r>
+    </w:p>
+    <w:p>
+      <w:pPr>
+        <w:pStyle w:val="af"/>
+        <w:rPr>
+          <w:color w:val="000000"/>
+        </w:rPr>
+      </w:pPr>
+      <w:r>
+        <w:rPr>
+          <w:color w:val="000000"/>
+        </w:rPr>
+        <w:t xml:space="preserve">        </w:t>
+      </w:r>
+      <w:r>
+        <w:t>SET</w:t>
+      </w:r>
+      <w:r>
+        <w:rPr>
+          <w:color w:val="000000"/>
+        </w:rPr>
+        <w:t xml:space="preserve"> experience = INTERVAL </w:t>
+      </w:r>
+      <w:r>
+        <w:rPr>
+          <w:color w:val="A31515"/>
+        </w:rPr>
+        <w:t>'0 days'</w:t>
+      </w:r>
+    </w:p>
+    <w:p>
+      <w:pPr>
+        <w:pStyle w:val="af"/>
+        <w:rPr>
+          <w:color w:val="000000"/>
+        </w:rPr>
+      </w:pPr>
+      <w:r>
+        <w:rPr>
+          <w:color w:val="000000"/>
+        </w:rPr>
+        <w:t xml:space="preserve">        </w:t>
+      </w:r>
+      <w:r>
+        <w:t>WHERE</w:t>
+      </w:r>
+      <w:r>
+        <w:rPr>
+          <w:color w:val="000000"/>
+        </w:rPr>
+        <w:t xml:space="preserve"> id = </w:t>
+      </w:r>
+      <w:proofErr w:type="spellStart"/>
+      <w:r>
+        <w:rPr>
+          <w:color w:val="000000"/>
+        </w:rPr>
+        <w:t>NEW.scientist_id</w:t>
+      </w:r>
+      <w:proofErr w:type="spellEnd"/>
+      <w:r>
+        <w:rPr>
+          <w:color w:val="000000"/>
+        </w:rPr>
+        <w:t>;</w:t>
+      </w:r>
+    </w:p>
+    <w:p>
+      <w:pPr>
+        <w:pStyle w:val="af"/>
+        <w:rPr>
+          <w:color w:val="000000"/>
+        </w:rPr>
+      </w:pPr>
+      <w:r>
+        <w:rPr>
+          <w:color w:val="000000"/>
+        </w:rPr>
+        <w:t xml:space="preserve">    </w:t>
+      </w:r>
+      <w:r>
+        <w:t>ELSE</w:t>
+      </w:r>
+    </w:p>
+    <w:p>
+      <w:pPr>
+        <w:pStyle w:val="af"/>
+        <w:rPr>
+          <w:color w:val="000000"/>
+        </w:rPr>
+      </w:pPr>
+      <w:r>
+        <w:rPr>
+          <w:color w:val="000000"/>
+        </w:rPr>
+        <w:t xml:space="preserve">        </w:t>
+      </w:r>
+      <w:proofErr w:type="spellStart"/>
+      <w:r>
+        <w:rPr>
+          <w:color w:val="000000"/>
+        </w:rPr>
+        <w:t>new_</w:t>
+      </w:r>
+      <w:proofErr w:type="gramStart"/>
+      <w:r>
+        <w:rPr>
+          <w:color w:val="000000"/>
+        </w:rPr>
+        <w:t>experience</w:t>
+      </w:r>
+      <w:proofErr w:type="spellEnd"/>
+      <w:r>
+        <w:rPr>
+          <w:color w:val="000000"/>
+        </w:rPr>
+        <w:t xml:space="preserve"> :</w:t>
+      </w:r>
+      <w:proofErr w:type="gramEnd"/>
+      <w:r>
+        <w:rPr>
+          <w:color w:val="000000"/>
+        </w:rPr>
+        <w:t xml:space="preserve">= AGE(CURRENT_DATE, </w:t>
+      </w:r>
+      <w:proofErr w:type="spellStart"/>
+      <w:r>
+        <w:rPr>
+          <w:color w:val="000000"/>
+        </w:rPr>
+        <w:t>first_trip_date</w:t>
+      </w:r>
+      <w:proofErr w:type="spellEnd"/>
+      <w:r>
+        <w:rPr>
+          <w:color w:val="000000"/>
+        </w:rPr>
+        <w:t>);</w:t>
+      </w:r>
+    </w:p>
+    <w:p>
+      <w:pPr>
+        <w:pStyle w:val="af"/>
+        <w:rPr>
+          <w:color w:val="000000"/>
+        </w:rPr>
+      </w:pPr>
+    </w:p>
+    <w:p>
+      <w:pPr>
+        <w:pStyle w:val="af"/>
+        <w:rPr>
+          <w:color w:val="000000"/>
+        </w:rPr>
+      </w:pPr>
+      <w:r>
+        <w:rPr>
+          <w:color w:val="000000"/>
+        </w:rPr>
+        <w:t xml:space="preserve">        </w:t>
+      </w:r>
+      <w:r>
+        <w:t>UPDATE</w:t>
+      </w:r>
+      <w:r>
+        <w:rPr>
+          <w:color w:val="000000"/>
+        </w:rPr>
+        <w:t xml:space="preserve"> Scientist</w:t>
+      </w:r>
+    </w:p>
+    <w:p>
+      <w:pPr>
+        <w:pStyle w:val="af"/>
+        <w:rPr>
+          <w:color w:val="000000"/>
+        </w:rPr>
+      </w:pPr>
+      <w:r>
+        <w:rPr>
+          <w:color w:val="000000"/>
+        </w:rPr>
+        <w:t xml:space="preserve">        </w:t>
+      </w:r>
+      <w:r>
+        <w:t>SET</w:t>
+      </w:r>
+      <w:r>
+        <w:rPr>
+          <w:color w:val="000000"/>
+        </w:rPr>
+        <w:t xml:space="preserve"> experience = </w:t>
+      </w:r>
+      <w:proofErr w:type="spellStart"/>
+      <w:r>
+        <w:rPr>
+          <w:color w:val="000000"/>
+        </w:rPr>
+        <w:t>new_experience</w:t>
+      </w:r>
+      <w:proofErr w:type="spellEnd"/>
+    </w:p>
+    <w:p>
+      <w:pPr>
+        <w:pStyle w:val="af"/>
+        <w:rPr>
+          <w:color w:val="000000"/>
+        </w:rPr>
+      </w:pPr>
+      <w:r>
+        <w:rPr>
+          <w:color w:val="000000"/>
+        </w:rPr>
+        <w:t xml:space="preserve">        </w:t>
+      </w:r>
+      <w:r>
+        <w:t>WHERE</w:t>
+      </w:r>
+      <w:r>
+        <w:rPr>
+          <w:color w:val="000000"/>
+        </w:rPr>
+        <w:t xml:space="preserve"> id = </w:t>
+      </w:r>
+      <w:proofErr w:type="spellStart"/>
+      <w:r>
+        <w:rPr>
+          <w:color w:val="000000"/>
+        </w:rPr>
+        <w:t>NEW.scientist_id</w:t>
+      </w:r>
+      <w:proofErr w:type="spellEnd"/>
+      <w:r>
+        <w:rPr>
+          <w:color w:val="000000"/>
+        </w:rPr>
+        <w:t>;</w:t>
+      </w:r>
+    </w:p>
+    <w:p>
+      <w:pPr>
+        <w:pStyle w:val="af"/>
+        <w:rPr>
+          <w:color w:val="000000"/>
+        </w:rPr>
+      </w:pPr>
+      <w:r>
+        <w:rPr>
+          <w:color w:val="000000"/>
+        </w:rPr>
+        <w:t xml:space="preserve">    </w:t>
+      </w:r>
+      <w:r>
+        <w:t>END</w:t>
+      </w:r>
+      <w:r>
+        <w:rPr>
+          <w:color w:val="000000"/>
+        </w:rPr>
+        <w:t xml:space="preserve"> </w:t>
+      </w:r>
+      <w:r>
+        <w:t>IF</w:t>
+      </w:r>
+      <w:r>
+        <w:rPr>
+          <w:color w:val="000000"/>
+        </w:rPr>
+        <w:t>;</w:t>
+      </w:r>
+    </w:p>
+    <w:p>
+      <w:pPr>
+        <w:pStyle w:val="af"/>
+        <w:rPr>
+          <w:color w:val="000000"/>
+        </w:rPr>
+      </w:pPr>
+    </w:p>
+    <w:p>
+      <w:pPr>
+        <w:pStyle w:val="af"/>
+        <w:rPr>
+          <w:color w:val="000000"/>
+        </w:rPr>
+      </w:pPr>
+      <w:r>
+        <w:rPr>
+          <w:color w:val="000000"/>
+        </w:rPr>
+        <w:t xml:space="preserve">    RAISE NOTICE </w:t>
+      </w:r>
+      <w:r>
+        <w:rPr>
+          <w:color w:val="A31515"/>
+        </w:rPr>
+        <w:t>'Calculated experience: %'</w:t>
+      </w:r>
+      <w:r>
+        <w:rPr>
+          <w:color w:val="000000"/>
+        </w:rPr>
+        <w:t xml:space="preserve">, </w:t>
+      </w:r>
+      <w:proofErr w:type="spellStart"/>
+      <w:r>
+        <w:rPr>
+          <w:color w:val="000000"/>
+        </w:rPr>
+        <w:t>new_experience</w:t>
+      </w:r>
+      <w:proofErr w:type="spellEnd"/>
+      <w:r>
+        <w:rPr>
+          <w:color w:val="000000"/>
+        </w:rPr>
+        <w:t>;</w:t>
+      </w:r>
+    </w:p>
+    <w:p>
+      <w:pPr>
+        <w:pStyle w:val="af"/>
+        <w:rPr>
+          <w:color w:val="000000"/>
+        </w:rPr>
+      </w:pPr>
+    </w:p>
+    <w:p>
+      <w:pPr>
+        <w:pStyle w:val="af"/>
+        <w:rPr>
+          <w:color w:val="000000"/>
+        </w:rPr>
+      </w:pPr>
+      <w:r>
+        <w:rPr>
+          <w:color w:val="000000"/>
+        </w:rPr>
+        <w:t xml:space="preserve">    </w:t>
+      </w:r>
+      <w:r>
+        <w:t>RETURN</w:t>
+      </w:r>
+      <w:r>
+        <w:rPr>
+          <w:color w:val="000000"/>
+        </w:rPr>
+        <w:t xml:space="preserve"> NEW;</w:t>
+      </w:r>
+    </w:p>
+    <w:p>
+      <w:pPr>
+        <w:pStyle w:val="af"/>
+        <w:rPr>
+          <w:color w:val="000000"/>
+        </w:rPr>
+      </w:pPr>
+      <w:r>
+        <w:t>END</w:t>
+      </w:r>
+      <w:r>
+        <w:rPr>
+          <w:color w:val="000000"/>
+        </w:rPr>
+        <w:t>;</w:t>
+      </w:r>
+    </w:p>
+    <w:p>
+      <w:pPr>
+        <w:pStyle w:val="af"/>
+        <w:rPr>
+          <w:color w:val="000000"/>
+        </w:rPr>
+      </w:pPr>
+      <w:r>
+        <w:rPr>
+          <w:color w:val="000000"/>
+        </w:rPr>
+        <w:t xml:space="preserve">$$ </w:t>
+      </w:r>
+      <w:r>
+        <w:t>LANGUAGE</w:t>
+      </w:r>
+      <w:r>
+        <w:rPr>
+          <w:color w:val="000000"/>
+        </w:rPr>
+        <w:t xml:space="preserve"> </w:t>
+      </w:r>
+      <w:proofErr w:type="spellStart"/>
+      <w:r>
+        <w:rPr>
+          <w:color w:val="000000"/>
+        </w:rPr>
+        <w:t>plpgsql</w:t>
+      </w:r>
+      <w:proofErr w:type="spellEnd"/>
+      <w:r>
+        <w:rPr>
+          <w:color w:val="000000"/>
+        </w:rPr>
+        <w:t>;</w:t>
+      </w:r>
+    </w:p>
+    <w:p>
+      <w:pPr>
+        <w:pStyle w:val="af"/>
+        <w:rPr>
+          <w:color w:val="000000"/>
+        </w:rPr>
+      </w:pPr>
+    </w:p>
+    <w:p>
+      <w:pPr>
+        <w:pStyle w:val="af"/>
+        <w:rPr>
+          <w:color w:val="000000"/>
+        </w:rPr>
+      </w:pPr>
+      <w:r>
+        <w:t>CREATE</w:t>
+      </w:r>
+      <w:r>
+        <w:rPr>
+          <w:color w:val="000000"/>
+        </w:rPr>
+        <w:t xml:space="preserve"> </w:t>
+      </w:r>
+      <w:r>
+        <w:t>TRIGGER</w:t>
+      </w:r>
+      <w:r>
+        <w:rPr>
+          <w:color w:val="000000"/>
+        </w:rPr>
+        <w:t xml:space="preserve"> </w:t>
+      </w:r>
+      <w:proofErr w:type="spellStart"/>
+      <w:r>
+        <w:t>calculate_scientists_experience</w:t>
+      </w:r>
+      <w:proofErr w:type="spellEnd"/>
+    </w:p>
+    <w:p>
+      <w:pPr>
+        <w:pStyle w:val="af"/>
+        <w:rPr>
+          <w:color w:val="000000"/>
+        </w:rPr>
+      </w:pPr>
+      <w:r>
+        <w:t>AFTER</w:t>
+      </w:r>
+      <w:r>
+        <w:rPr>
+          <w:color w:val="000000"/>
+        </w:rPr>
+        <w:t xml:space="preserve"> </w:t>
+      </w:r>
+      <w:r>
+        <w:t>INSERT</w:t>
+      </w:r>
+      <w:r>
+        <w:rPr>
+          <w:color w:val="000000"/>
+        </w:rPr>
+        <w:t xml:space="preserve"> </w:t>
+      </w:r>
+      <w:r>
+        <w:t>ON</w:t>
+      </w:r>
+      <w:r>
+        <w:rPr>
+          <w:color w:val="000000"/>
+        </w:rPr>
+        <w:t xml:space="preserve"> Trip</w:t>
+      </w:r>
+    </w:p>
+    <w:p>
+      <w:pPr>
+        <w:pStyle w:val="af"/>
+        <w:rPr>
+          <w:color w:val="000000"/>
+        </w:rPr>
+      </w:pPr>
+      <w:r>
+        <w:t>FOR</w:t>
+      </w:r>
+      <w:r>
+        <w:rPr>
+          <w:color w:val="000000"/>
+        </w:rPr>
+        <w:t xml:space="preserve"> EACH </w:t>
+      </w:r>
+      <w:r>
+        <w:t>ROW</w:t>
+      </w:r>
+      <w:r>
+        <w:rPr>
+          <w:color w:val="000000"/>
+        </w:rPr>
+        <w:t xml:space="preserve"> </w:t>
+      </w:r>
+    </w:p>
+    <w:p>
+      <w:pPr>
+        <w:pStyle w:val="af"/>
+        <w:rPr>
+          <w:color w:val="000000"/>
+        </w:rPr>
+      </w:pPr>
+      <w:r>
+        <w:t>EXECUTE</w:t>
+      </w:r>
+      <w:r>
+        <w:rPr>
+          <w:color w:val="000000"/>
+        </w:rPr>
+        <w:t xml:space="preserve"> </w:t>
+      </w:r>
+      <w:r>
+        <w:t>FUNCTION</w:t>
+      </w:r>
+      <w:r>
+        <w:rPr>
+          <w:color w:val="000000"/>
+        </w:rPr>
+        <w:t xml:space="preserve"> </w:t>
+      </w:r>
+      <w:proofErr w:type="spellStart"/>
+      <w:r>
+        <w:rPr>
+          <w:color w:val="000000"/>
+        </w:rPr>
+        <w:t>trigger_calculate_scientist_</w:t>
+      </w:r>
+      <w:proofErr w:type="gramStart"/>
+      <w:r>
+        <w:rPr>
+          <w:color w:val="000000"/>
+        </w:rPr>
+        <w:t>experience</w:t>
+      </w:r>
+      <w:proofErr w:type="spellEnd"/>
+      <w:r>
+        <w:rPr>
+          <w:color w:val="000000"/>
+        </w:rPr>
+        <w:t>(</w:t>
+      </w:r>
+      <w:proofErr w:type="gramEnd"/>
+      <w:r>
+        <w:rPr>
+          <w:color w:val="000000"/>
+        </w:rPr>
+        <w:t>);</w:t>
+      </w:r>
+    </w:p>
+    <w:p>
+      <w:pPr>
+        <w:rPr>
+          <w:lang w:val="en-US"/>
+        </w:rPr>
+      </w:pPr>
     </w:p>
     <w:p>
       <w:pPr>
         <w:pStyle w:val="1"/>
       </w:pPr>
-      <w:r>
-        <w:t>Денормализация</w:t>
-      </w:r>
-    </w:p>
-    <w:p>
-      <w:r>
-        <w:t xml:space="preserve">Чтобы уменьшить количество операций </w:t>
-      </w:r>
-      <w:r>
-        <w:rPr>
-          <w:lang w:val="en-US"/>
-        </w:rPr>
-        <w:t>JOIN</w:t>
-      </w:r>
-      <w:r>
-        <w:t xml:space="preserve"> </w:t>
-      </w:r>
-      <w:r>
-        <w:t xml:space="preserve">и ускорить обработку запрос, можно объединить некоторые таблицы. Например, объединить таблицы </w:t>
-      </w:r>
-      <w:r>
-        <w:rPr>
-          <w:lang w:val="en-US"/>
-        </w:rPr>
-        <w:t>Scientist</w:t>
-      </w:r>
-      <w:r>
-        <w:t xml:space="preserve"> </w:t>
-      </w:r>
-      <w:r>
-        <w:t xml:space="preserve">и </w:t>
-      </w:r>
-      <w:r>
-        <w:rPr>
-          <w:lang w:val="en-US"/>
-        </w:rPr>
-        <w:t>Education</w:t>
-      </w:r>
-      <w:r>
-        <w:t xml:space="preserve">, </w:t>
-      </w:r>
-      <w:r>
-        <w:t>если часто нужен допуск к уровню образования ученого.</w:t>
-      </w:r>
-    </w:p>
-    <w:p>
-      <w:pPr>
-        <w:pStyle w:val="1"/>
-      </w:pPr>
-      <w:r>
-        <w:t>Триггер и функция</w:t>
-      </w:r>
-    </w:p>
-    <w:p>
-      <w:pPr>
-        <w:rPr>
-          <w:lang w:val="en-US"/>
-        </w:rPr>
-      </w:pPr>
-      <w:r>
-        <w:t>Функция вычисляет стаж ученого, то есть находит дату первой командировки (</w:t>
-      </w:r>
-      <w:r>
-        <w:rPr>
-          <w:lang w:val="en-US"/>
-        </w:rPr>
-        <w:t>Trip</w:t>
-      </w:r>
-      <w:r>
-        <w:t>) и вычитает ее из текущей даты.</w:t>
-      </w:r>
-    </w:p>
-    <w:p>
-      <w:pPr>
-        <w:pStyle w:val="af"/>
-        <w:rPr>
-          <w:color w:val="000000"/>
-        </w:rPr>
-      </w:pPr>
+      <w:bookmarkStart w:id="5" w:name="_Toc225325276"/>
       <w:r>
         <w:lastRenderedPageBreak/>
-        <w:t>CREATE OR REPLACE</w:t>
-      </w:r>
-      <w:r>
-        <w:rPr>
-          <w:color w:val="000000"/>
-        </w:rPr>
-        <w:t xml:space="preserve"> </w:t>
-      </w:r>
-      <w:r>
-        <w:t>FUNCTION</w:t>
-      </w:r>
-      <w:r>
-        <w:rPr>
-          <w:color w:val="000000"/>
-        </w:rPr>
-        <w:t xml:space="preserve"> </w:t>
-      </w:r>
-      <w:r>
-        <w:t>trigger_calculate_scientist_experience</w:t>
-      </w:r>
-      <w:r>
-        <w:rPr>
-          <w:color w:val="000000"/>
-        </w:rPr>
-        <w:t>()</w:t>
-      </w:r>
-    </w:p>
-    <w:p>
-      <w:pPr>
-        <w:pStyle w:val="af"/>
-        <w:rPr>
-          <w:color w:val="000000"/>
-        </w:rPr>
-      </w:pPr>
-      <w:r>
-        <w:t>RETURNS</w:t>
-      </w:r>
-      <w:r>
-        <w:rPr>
-          <w:color w:val="000000"/>
-        </w:rPr>
-        <w:t xml:space="preserve"> TRIGGER </w:t>
-      </w:r>
-      <w:r>
-        <w:t>AS</w:t>
-      </w:r>
-      <w:r>
-        <w:rPr>
-          <w:color w:val="000000"/>
-        </w:rPr>
-        <w:t xml:space="preserve"> $$</w:t>
-      </w:r>
-    </w:p>
-    <w:p>
-      <w:pPr>
-        <w:pStyle w:val="af"/>
-        <w:rPr>
-          <w:color w:val="000000"/>
-        </w:rPr>
-      </w:pPr>
-      <w:r>
-        <w:t>DECLARE</w:t>
-      </w:r>
-    </w:p>
-    <w:p>
-      <w:pPr>
-        <w:pStyle w:val="af"/>
-        <w:rPr>
-          <w:color w:val="000000"/>
-        </w:rPr>
-      </w:pPr>
-      <w:r>
-        <w:rPr>
-          <w:color w:val="000000"/>
-        </w:rPr>
-        <w:t xml:space="preserve">    first_trip_date </w:t>
-      </w:r>
-      <w:r>
-        <w:t>DATE</w:t>
-      </w:r>
-      <w:r>
-        <w:rPr>
-          <w:color w:val="000000"/>
-        </w:rPr>
-        <w:t>;</w:t>
-      </w:r>
-    </w:p>
-    <w:p>
-      <w:pPr>
-        <w:pStyle w:val="af"/>
-        <w:rPr>
-          <w:color w:val="000000"/>
-        </w:rPr>
-      </w:pPr>
-      <w:r>
-        <w:rPr>
-          <w:color w:val="000000"/>
-        </w:rPr>
-        <w:t>    new_experience INTERVAL;</w:t>
-      </w:r>
-    </w:p>
-    <w:p>
-      <w:pPr>
-        <w:pStyle w:val="af"/>
-        <w:rPr>
-          <w:color w:val="000000"/>
-        </w:rPr>
-      </w:pPr>
-      <w:r>
-        <w:t>BEGIN</w:t>
-      </w:r>
-    </w:p>
-    <w:p>
-      <w:pPr>
-        <w:pStyle w:val="af"/>
-        <w:rPr>
-          <w:color w:val="000000"/>
-        </w:rPr>
-      </w:pPr>
-      <w:r>
-        <w:rPr>
-          <w:color w:val="000000"/>
-        </w:rPr>
-        <w:t xml:space="preserve"> RAISE NOTICE </w:t>
-      </w:r>
-      <w:r>
-        <w:rPr>
-          <w:color w:val="A31515"/>
-        </w:rPr>
-        <w:t>'Calculating experience for scientist_id: %'</w:t>
-      </w:r>
-      <w:r>
-        <w:rPr>
-          <w:color w:val="000000"/>
-        </w:rPr>
-        <w:t>, NEW.scientist_id;</w:t>
-      </w:r>
-    </w:p>
-    <w:p>
-      <w:pPr>
-        <w:pStyle w:val="af"/>
-        <w:rPr>
-          <w:color w:val="000000"/>
-        </w:rPr>
-      </w:pPr>
-      <w:r>
-        <w:rPr>
-          <w:color w:val="000000"/>
-        </w:rPr>
-        <w:t xml:space="preserve">    </w:t>
-      </w:r>
-      <w:r>
-        <w:t>SELECT</w:t>
-      </w:r>
-      <w:r>
-        <w:rPr>
-          <w:color w:val="000000"/>
-        </w:rPr>
-        <w:t xml:space="preserve"> </w:t>
-      </w:r>
-      <w:r>
-        <w:t>MIN</w:t>
-      </w:r>
-      <w:r>
-        <w:rPr>
-          <w:color w:val="000000"/>
-        </w:rPr>
-        <w:t xml:space="preserve">(departure_date) </w:t>
-      </w:r>
-      <w:r>
-        <w:t>INTO</w:t>
-      </w:r>
-      <w:r>
-        <w:rPr>
-          <w:color w:val="000000"/>
-        </w:rPr>
-        <w:t xml:space="preserve"> first_trip_date</w:t>
-      </w:r>
-    </w:p>
-    <w:p>
-      <w:pPr>
-        <w:pStyle w:val="af"/>
-        <w:rPr>
-          <w:color w:val="000000"/>
-        </w:rPr>
-      </w:pPr>
-      <w:r>
-        <w:rPr>
-          <w:color w:val="000000"/>
-        </w:rPr>
-        <w:t xml:space="preserve">    </w:t>
-      </w:r>
-      <w:r>
-        <w:t>FROM</w:t>
-      </w:r>
-      <w:r>
-        <w:rPr>
-          <w:color w:val="000000"/>
-        </w:rPr>
-        <w:t xml:space="preserve"> Trip</w:t>
-      </w:r>
-    </w:p>
-    <w:p>
-      <w:pPr>
-        <w:pStyle w:val="af"/>
-        <w:rPr>
-          <w:color w:val="000000"/>
-        </w:rPr>
-      </w:pPr>
-      <w:r>
-        <w:rPr>
-          <w:color w:val="000000"/>
-        </w:rPr>
-        <w:t xml:space="preserve">    </w:t>
-      </w:r>
-      <w:r>
-        <w:t>WHERE</w:t>
-      </w:r>
-      <w:r>
-        <w:rPr>
-          <w:color w:val="000000"/>
-        </w:rPr>
-        <w:t xml:space="preserve"> scientist_id = NEW.scientist_id;</w:t>
-      </w:r>
-    </w:p>
-    <w:p>
-      <w:pPr>
-        <w:pStyle w:val="af"/>
-        <w:rPr>
-          <w:color w:val="000000"/>
-        </w:rPr>
-      </w:pPr>
-    </w:p>
-    <w:p>
-      <w:pPr>
-        <w:pStyle w:val="af"/>
-        <w:rPr>
-          <w:color w:val="000000"/>
-        </w:rPr>
-      </w:pPr>
-      <w:r>
-        <w:rPr>
-          <w:color w:val="000000"/>
-        </w:rPr>
-        <w:t xml:space="preserve">    RAISE NOTICE </w:t>
-      </w:r>
-      <w:r>
-        <w:rPr>
-          <w:color w:val="A31515"/>
-        </w:rPr>
-        <w:t>'First trip date: %'</w:t>
-      </w:r>
-      <w:r>
-        <w:rPr>
-          <w:color w:val="000000"/>
-        </w:rPr>
-        <w:t>, first_trip_date;</w:t>
-      </w:r>
-    </w:p>
-    <w:p>
-      <w:pPr>
-        <w:pStyle w:val="af"/>
-        <w:rPr>
-          <w:color w:val="000000"/>
-        </w:rPr>
-      </w:pPr>
-    </w:p>
-    <w:p>
-      <w:pPr>
-        <w:pStyle w:val="af"/>
-        <w:rPr>
-          <w:color w:val="000000"/>
-        </w:rPr>
-      </w:pPr>
-      <w:r>
-        <w:rPr>
-          <w:color w:val="000000"/>
-        </w:rPr>
-        <w:t xml:space="preserve">    </w:t>
-      </w:r>
-      <w:r>
-        <w:t>IF</w:t>
-      </w:r>
-      <w:r>
-        <w:rPr>
-          <w:color w:val="000000"/>
-        </w:rPr>
-        <w:t xml:space="preserve"> first_trip_date </w:t>
-      </w:r>
-      <w:r>
-        <w:t>IS</w:t>
-      </w:r>
-      <w:r>
-        <w:rPr>
-          <w:color w:val="000000"/>
-        </w:rPr>
-        <w:t xml:space="preserve"> </w:t>
-      </w:r>
-      <w:r>
-        <w:t>NULL</w:t>
-      </w:r>
-      <w:r>
-        <w:rPr>
-          <w:color w:val="000000"/>
-        </w:rPr>
-        <w:t xml:space="preserve"> </w:t>
-      </w:r>
-      <w:r>
-        <w:t>THEN</w:t>
-      </w:r>
-    </w:p>
-    <w:p>
-      <w:pPr>
-        <w:pStyle w:val="af"/>
-        <w:rPr>
-          <w:color w:val="000000"/>
-        </w:rPr>
-      </w:pPr>
-      <w:r>
-        <w:rPr>
-          <w:color w:val="000000"/>
-        </w:rPr>
-        <w:t xml:space="preserve">        RAISE EXCEPTION </w:t>
-      </w:r>
-      <w:r>
-        <w:rPr>
-          <w:color w:val="A31515"/>
-        </w:rPr>
-        <w:t>'No trips found for the scientist with ID %'</w:t>
-      </w:r>
-      <w:r>
-        <w:rPr>
-          <w:color w:val="000000"/>
-        </w:rPr>
-        <w:t>, NEW.scientist_id;</w:t>
-      </w:r>
-    </w:p>
-    <w:p>
-      <w:pPr>
-        <w:pStyle w:val="af"/>
-        <w:rPr>
-          <w:color w:val="000000"/>
-        </w:rPr>
-      </w:pPr>
-      <w:r>
-        <w:rPr>
-          <w:color w:val="000000"/>
-        </w:rPr>
-        <w:t xml:space="preserve">    ELSIF first_trip_date &gt; CURRENT_DATE </w:t>
-      </w:r>
-      <w:r>
-        <w:t>THEN</w:t>
-      </w:r>
-    </w:p>
-    <w:p>
-      <w:pPr>
-        <w:pStyle w:val="af"/>
-        <w:rPr>
-          <w:color w:val="000000"/>
-        </w:rPr>
-      </w:pPr>
-      <w:r>
-        <w:rPr>
-          <w:color w:val="000000"/>
-        </w:rPr>
-        <w:t xml:space="preserve">        </w:t>
-      </w:r>
-      <w:r>
-        <w:t>UPDATE</w:t>
-      </w:r>
-      <w:r>
-        <w:rPr>
-          <w:color w:val="000000"/>
-        </w:rPr>
-        <w:t xml:space="preserve"> Scientist</w:t>
-      </w:r>
-    </w:p>
-    <w:p>
-      <w:pPr>
-        <w:pStyle w:val="af"/>
-        <w:rPr>
-          <w:color w:val="000000"/>
-        </w:rPr>
-      </w:pPr>
-      <w:r>
-        <w:rPr>
-          <w:color w:val="000000"/>
-        </w:rPr>
-        <w:t xml:space="preserve">        </w:t>
-      </w:r>
-      <w:r>
-        <w:t>SET</w:t>
-      </w:r>
-      <w:r>
-        <w:rPr>
-          <w:color w:val="000000"/>
-        </w:rPr>
-        <w:t xml:space="preserve"> experience = INTERVAL </w:t>
-      </w:r>
-      <w:r>
-        <w:rPr>
-          <w:color w:val="A31515"/>
-        </w:rPr>
-        <w:t>'0 days'</w:t>
-      </w:r>
-    </w:p>
-    <w:p>
-      <w:pPr>
-        <w:pStyle w:val="af"/>
-        <w:rPr>
-          <w:color w:val="000000"/>
-        </w:rPr>
-      </w:pPr>
-      <w:r>
-        <w:rPr>
-          <w:color w:val="000000"/>
-        </w:rPr>
-        <w:t xml:space="preserve">        </w:t>
-      </w:r>
-      <w:r>
-        <w:t>WHERE</w:t>
-      </w:r>
-      <w:r>
-        <w:rPr>
-          <w:color w:val="000000"/>
-        </w:rPr>
-        <w:t xml:space="preserve"> id = NEW.scientist_id;</w:t>
-      </w:r>
-    </w:p>
-    <w:p>
-      <w:pPr>
-        <w:pStyle w:val="af"/>
-        <w:rPr>
-          <w:color w:val="000000"/>
-        </w:rPr>
-      </w:pPr>
-      <w:r>
-        <w:rPr>
-          <w:color w:val="000000"/>
-        </w:rPr>
-        <w:t xml:space="preserve">    </w:t>
-      </w:r>
-      <w:r>
-        <w:t>ELSE</w:t>
-      </w:r>
-    </w:p>
-    <w:p>
-      <w:pPr>
-        <w:pStyle w:val="af"/>
-        <w:rPr>
-          <w:color w:val="000000"/>
-        </w:rPr>
-      </w:pPr>
-      <w:r>
-        <w:rPr>
-          <w:color w:val="000000"/>
-        </w:rPr>
-        <w:t>        new_experience := AGE(CURRENT_DATE, first_trip_date);</w:t>
-      </w:r>
-    </w:p>
-    <w:p>
-      <w:pPr>
-        <w:pStyle w:val="af"/>
-        <w:rPr>
-          <w:color w:val="000000"/>
-        </w:rPr>
-      </w:pPr>
-    </w:p>
-    <w:p>
-      <w:pPr>
-        <w:pStyle w:val="af"/>
-        <w:rPr>
-          <w:color w:val="000000"/>
-        </w:rPr>
-      </w:pPr>
-      <w:r>
-        <w:rPr>
-          <w:color w:val="000000"/>
-        </w:rPr>
-        <w:t xml:space="preserve">        </w:t>
-      </w:r>
-      <w:r>
-        <w:t>UPDATE</w:t>
-      </w:r>
-      <w:r>
-        <w:rPr>
-          <w:color w:val="000000"/>
-        </w:rPr>
-        <w:t xml:space="preserve"> Scientist</w:t>
-      </w:r>
-    </w:p>
-    <w:p>
-      <w:pPr>
-        <w:pStyle w:val="af"/>
-        <w:rPr>
-          <w:color w:val="000000"/>
-        </w:rPr>
-      </w:pPr>
-      <w:r>
-        <w:rPr>
-          <w:color w:val="000000"/>
-        </w:rPr>
-        <w:t xml:space="preserve">        </w:t>
-      </w:r>
-      <w:r>
-        <w:t>SET</w:t>
-      </w:r>
-      <w:r>
-        <w:rPr>
-          <w:color w:val="000000"/>
-        </w:rPr>
-        <w:t xml:space="preserve"> experience = new_experience</w:t>
-      </w:r>
-    </w:p>
-    <w:p>
-      <w:pPr>
-        <w:pStyle w:val="af"/>
-        <w:rPr>
-          <w:color w:val="000000"/>
-        </w:rPr>
-      </w:pPr>
-      <w:r>
-        <w:rPr>
-          <w:color w:val="000000"/>
-        </w:rPr>
-        <w:t xml:space="preserve">        </w:t>
-      </w:r>
-      <w:r>
-        <w:t>WHERE</w:t>
-      </w:r>
-      <w:r>
-        <w:rPr>
-          <w:color w:val="000000"/>
-        </w:rPr>
-        <w:t xml:space="preserve"> id = NEW.scientist_id;</w:t>
-      </w:r>
-    </w:p>
-    <w:p>
-      <w:pPr>
-        <w:pStyle w:val="af"/>
-        <w:rPr>
-          <w:color w:val="000000"/>
-        </w:rPr>
-      </w:pPr>
-      <w:r>
-        <w:rPr>
-          <w:color w:val="000000"/>
-        </w:rPr>
-        <w:t xml:space="preserve">    </w:t>
-      </w:r>
-      <w:r>
-        <w:t>END</w:t>
-      </w:r>
-      <w:r>
-        <w:rPr>
-          <w:color w:val="000000"/>
-        </w:rPr>
-        <w:t xml:space="preserve"> </w:t>
-      </w:r>
-      <w:r>
-        <w:t>IF</w:t>
-      </w:r>
-      <w:r>
-        <w:rPr>
-          <w:color w:val="000000"/>
-        </w:rPr>
-        <w:t>;</w:t>
-      </w:r>
-    </w:p>
-    <w:p>
-      <w:pPr>
-        <w:pStyle w:val="af"/>
-        <w:rPr>
-          <w:color w:val="000000"/>
-        </w:rPr>
-      </w:pPr>
-    </w:p>
-    <w:p>
-      <w:pPr>
-        <w:pStyle w:val="af"/>
-        <w:rPr>
-          <w:color w:val="000000"/>
-        </w:rPr>
-      </w:pPr>
-      <w:r>
-        <w:rPr>
-          <w:color w:val="000000"/>
-        </w:rPr>
-        <w:t xml:space="preserve">    RAISE NOTICE </w:t>
-      </w:r>
-      <w:r>
-        <w:rPr>
-          <w:color w:val="A31515"/>
-        </w:rPr>
-        <w:t>'Calculated experience: %'</w:t>
-      </w:r>
-      <w:r>
-        <w:rPr>
-          <w:color w:val="000000"/>
-        </w:rPr>
-        <w:t>, new_experience;</w:t>
-      </w:r>
-    </w:p>
-    <w:p>
-      <w:pPr>
-        <w:pStyle w:val="af"/>
-        <w:rPr>
-          <w:color w:val="000000"/>
-        </w:rPr>
-      </w:pPr>
-    </w:p>
-    <w:p>
-      <w:pPr>
-        <w:pStyle w:val="af"/>
-        <w:rPr>
-          <w:color w:val="000000"/>
-        </w:rPr>
-      </w:pPr>
-      <w:r>
-        <w:rPr>
-          <w:color w:val="000000"/>
-        </w:rPr>
-        <w:t xml:space="preserve">    </w:t>
-      </w:r>
-      <w:r>
-        <w:t>RETURN</w:t>
-      </w:r>
-      <w:r>
-        <w:rPr>
-          <w:color w:val="000000"/>
-        </w:rPr>
-        <w:t xml:space="preserve"> NEW;</w:t>
-      </w:r>
-    </w:p>
-    <w:p>
-      <w:pPr>
-        <w:pStyle w:val="af"/>
-        <w:rPr>
-          <w:color w:val="000000"/>
-        </w:rPr>
-      </w:pPr>
-      <w:r>
-        <w:t>END</w:t>
-      </w:r>
-      <w:r>
-        <w:rPr>
-          <w:color w:val="000000"/>
-        </w:rPr>
-        <w:t>;</w:t>
-      </w:r>
-    </w:p>
-    <w:p>
-      <w:pPr>
-        <w:pStyle w:val="af"/>
-        <w:rPr>
-          <w:color w:val="000000"/>
-        </w:rPr>
-      </w:pPr>
-      <w:r>
-        <w:rPr>
-          <w:color w:val="000000"/>
-        </w:rPr>
-        <w:t xml:space="preserve">$$ </w:t>
-      </w:r>
-      <w:r>
-        <w:t>LANGUAGE</w:t>
-      </w:r>
-      <w:r>
-        <w:rPr>
-          <w:color w:val="000000"/>
-        </w:rPr>
-        <w:t xml:space="preserve"> plpgsql;</w:t>
-      </w:r>
-    </w:p>
-    <w:p>
-      <w:pPr>
-        <w:pStyle w:val="af"/>
-        <w:rPr>
-          <w:color w:val="000000"/>
-        </w:rPr>
-      </w:pPr>
-    </w:p>
-    <w:p>
-      <w:pPr>
-        <w:pStyle w:val="af"/>
-        <w:rPr>
-          <w:color w:val="000000"/>
-        </w:rPr>
-      </w:pPr>
-      <w:r>
-        <w:t>CREATE</w:t>
-      </w:r>
-      <w:r>
-        <w:rPr>
-          <w:color w:val="000000"/>
-        </w:rPr>
-        <w:t xml:space="preserve"> </w:t>
-      </w:r>
-      <w:r>
-        <w:t>TRIGGER</w:t>
-      </w:r>
-      <w:r>
-        <w:rPr>
-          <w:color w:val="000000"/>
-        </w:rPr>
-        <w:t xml:space="preserve"> </w:t>
-      </w:r>
-      <w:r>
-        <w:t>calculate_scientists_experience</w:t>
-      </w:r>
-    </w:p>
-    <w:p>
-      <w:pPr>
-        <w:pStyle w:val="af"/>
-        <w:rPr>
-          <w:color w:val="000000"/>
-        </w:rPr>
-      </w:pPr>
-      <w:r>
-        <w:t>AFTER</w:t>
-      </w:r>
-      <w:r>
-        <w:rPr>
-          <w:color w:val="000000"/>
-        </w:rPr>
-        <w:t xml:space="preserve"> </w:t>
-      </w:r>
-      <w:r>
-        <w:t>INSERT</w:t>
-      </w:r>
-      <w:r>
-        <w:rPr>
-          <w:color w:val="000000"/>
-        </w:rPr>
-        <w:t xml:space="preserve"> </w:t>
-      </w:r>
-      <w:r>
-        <w:t>ON</w:t>
-      </w:r>
-      <w:r>
-        <w:rPr>
-          <w:color w:val="000000"/>
-        </w:rPr>
-        <w:t xml:space="preserve"> Trip</w:t>
-      </w:r>
-    </w:p>
-    <w:p>
-      <w:pPr>
-        <w:pStyle w:val="af"/>
-        <w:rPr>
-          <w:color w:val="000000"/>
-        </w:rPr>
-      </w:pPr>
-      <w:r>
-        <w:t>FOR</w:t>
-      </w:r>
-      <w:r>
-        <w:rPr>
-          <w:color w:val="000000"/>
-        </w:rPr>
-        <w:t xml:space="preserve"> EACH </w:t>
-      </w:r>
-      <w:r>
-        <w:t>ROW</w:t>
-      </w:r>
-      <w:r>
-        <w:rPr>
-          <w:color w:val="000000"/>
-        </w:rPr>
-        <w:t xml:space="preserve"> </w:t>
-      </w:r>
-    </w:p>
-    <w:p>
-      <w:pPr>
-        <w:pStyle w:val="af"/>
-        <w:rPr>
-          <w:color w:val="000000"/>
-        </w:rPr>
-      </w:pPr>
-      <w:r>
-        <w:t>EXECUTE</w:t>
-      </w:r>
-      <w:r>
-        <w:rPr>
-          <w:color w:val="000000"/>
-        </w:rPr>
-        <w:t xml:space="preserve"> </w:t>
-      </w:r>
-      <w:r>
-        <w:t>FUNCTION</w:t>
-      </w:r>
-      <w:r>
-        <w:rPr>
-          <w:color w:val="000000"/>
-        </w:rPr>
-        <w:t xml:space="preserve"> trigger_calculate_scientist_experience();</w:t>
-      </w:r>
-    </w:p>
-    <w:p>
-      <w:pPr>
-        <w:rPr>
-          <w:lang w:val="en-US"/>
-        </w:rPr>
-      </w:pPr>
-    </w:p>
-    <w:p>
-      <w:pPr>
-        <w:pStyle w:val="1"/>
-      </w:pPr>
-      <w:bookmarkStart w:id="1" w:name="_Toc222942449"/>
-      <w:r>
         <w:t>Вывод</w:t>
       </w:r>
-      <w:bookmarkEnd w:id="1"/>
+      <w:bookmarkEnd w:id="5"/>
     </w:p>
     <w:p>
       <w:r>
         <w:t xml:space="preserve">В ходе выполнения работы я </w:t>
       </w:r>
       <w:r>
-        <w:t xml:space="preserve">познакомился с понятием нормализации и денормализации. Научился писать функции на </w:t>
+        <w:t xml:space="preserve">познакомился с понятием нормализации и </w:t>
+      </w:r>
+      <w:proofErr w:type="spellStart"/>
+      <w:r>
+        <w:t>денормализации</w:t>
+      </w:r>
+      <w:proofErr w:type="spellEnd"/>
+      <w:r>
+        <w:t xml:space="preserve">. Научился писать функции на </w:t>
       </w:r>
       <w:r>
         <w:rPr>
@@ -4037,6 +4314,7 @@
   <w:style w:type="character" w:default="1" w:styleId="a0">
     <w:name w:val="Default Paragraph Font"/>
     <w:uiPriority w:val="1"/>
+    <w:semiHidden/>
     <w:unhideWhenUsed/>
   </w:style>
   <w:style w:type="table" w:default="1" w:styleId="a1">

</xml_diff>